<commit_message>
Rewrite report passages reused from the synopsis; degraded-threshold experiment script; compose profile; docs
Co-Authored-By: Claude Sonnet 5.5 <noreply@anthropic.com>
</commit_message>
<xml_diff>
--- a/Mid_Semester_Report_Agentic_RAG_Digital_Forensics.docx
+++ b/Mid_Semester_Report_Agentic_RAG_Digital_Forensics.docx
@@ -633,7 +633,6 @@
         <w:spacing w:line="360" w:lineRule="auto"/>
         <w:rPr>
           <w:sz w:val="24"/>
-          <w:szCs w:val="24"/>
         </w:rPr>
       </w:pPr>
       <w:r>
@@ -641,7 +640,7 @@
           <w:sz w:val="24"/>
           <w:szCs w:val="24"/>
         </w:rPr>
-        <w:t>We hereby certify that the project work entitled “Agentic AI and RAG-Based Framework for Digital Forensics” is being carried out as part of the requirements for the award of the Degree of Bachelor of Technology in Computer Science and Engineering with specialization in Artificial Intelligence &amp; Machine Learning, School of Computer Science, University of Petroleum &amp; Energy Studies, Dehradun, under the guidance of Dr. Anish Kumar Vishwakarma.</w:t>
+        <w:t xml:space="preserve">We certify that the project titled “Agentic AI and RAG-Based Framework for Digital Forensics” is being carried out in partial fulfilment of the requirements for the degree of Bachelor of Technology in Computer Science and Engineering (specialisation in Artificial Intelligence and Machine Learning) at the School of Computer Science, University of Petroleum and Energy Studies, Dehradun, under the guidance of Dr. Anish Kumar Vishwakarma.</w:t>
       </w:r>
     </w:p>
     <w:p>
@@ -656,7 +655,7 @@
           <w:sz w:val="24"/>
           <w:szCs w:val="24"/>
         </w:rPr>
-        <w:t xml:space="preserve">This report presents the work completed up to the mid-semester stage of the project: the system design as built, the implementation, and the experimental results obtained so far. The work described here is our own. Wherever ideas, datasets or methods from published work have been used, the corresponding sources have been acknowledged. Results are reported as measured, including those that were weaker than expected.</w:t>
+        <w:t xml:space="preserve">This report covers the project up to its mid-semester stage: the design as it was built, how it was implemented, and the results measured so far. The work described is our own. Wherever ideas, datasets or methods from published work have been used, the sources are acknowledged. Results are reported as measured, including those that were weaker than expected.</w:t>
       </w:r>
     </w:p>
     <w:p>
@@ -664,7 +663,6 @@
         <w:spacing w:line="360" w:lineRule="auto"/>
         <w:rPr>
           <w:sz w:val="24"/>
-          <w:szCs w:val="24"/>
         </w:rPr>
       </w:pPr>
       <w:r>
@@ -672,7 +670,7 @@
           <w:sz w:val="24"/>
           <w:szCs w:val="24"/>
         </w:rPr>
-        <w:t>The matter presented in this synopsis has not been submitted by us for the award of any other degree or diploma.</w:t>
+        <w:t xml:space="preserve">This work has not been submitted to any other university or institution for the award of a degree or diploma.</w:t>
       </w:r>
     </w:p>
     <w:p>
@@ -776,10 +774,8 @@
     </w:p>
     <w:p>
       <w:pPr>
-        <w:spacing w:line="360" w:lineRule="auto"/>
-        <w:rPr>
-          <w:sz w:val="24"/>
-          <w:szCs w:val="24"/>
+        <w:rPr>
+          <w:sz w:val="24"/>
         </w:rPr>
       </w:pPr>
       <w:r>
@@ -787,7 +783,7 @@
           <w:sz w:val="24"/>
           <w:szCs w:val="24"/>
         </w:rPr>
-        <w:t>We would like to express our sincere gratitude to our project guide, Dr. Anish Kumar Vishwakarma, Assistant Professor, School of Computer Science, UPES Dehradun, for his guidance and constructive suggestions during the planning of this project. His feedback has helped us define a practical scope that combines digital forensics, machine learning and modern agent-based systems.</w:t>
+        <w:t xml:space="preserve">Our thanks go to our guide, Dr. Anish Kumar Vishwakarma of the School of Computer Science, UPES Dehradun, whose direction and questions helped us settle the scope of this project.</w:t>
       </w:r>
     </w:p>
     <w:p>
@@ -801,15 +797,13 @@
           <w:sz w:val="24"/>
           <w:szCs w:val="24"/>
         </w:rPr>
-        <w:t xml:space="preserve">We are thankful to the School of Computer Science, UPES, for providing the academic environment and the computing resources used for training and evaluation. We also acknowledge the researchers and maintainers of the public datasets, benchmark suites and open-source frameworks on which this work depends.</w:t>
+        <w:t xml:space="preserve">The School of Computer Science, UPES, gave us the academic setting and the computing time needed for training and testing. We also credit the authors and maintainers of the public datasets, benchmarks and open-source libraries on which this work is built.</w:t>
       </w:r>
     </w:p>
     <w:p>
       <w:pPr>
-        <w:spacing w:line="360" w:lineRule="auto"/>
-        <w:rPr>
-          <w:sz w:val="24"/>
-          <w:szCs w:val="24"/>
+        <w:rPr>
+          <w:sz w:val="24"/>
         </w:rPr>
       </w:pPr>
       <w:r>
@@ -817,7 +811,21 @@
           <w:sz w:val="24"/>
           <w:szCs w:val="24"/>
         </w:rPr>
-        <w:t>Finally, we thank our classmates, friends and families for their encouragement and support throughout the project.</w:t>
+        <w:t xml:space="preserve">We also thank our classmates and families for their support during the project.</w:t>
+      </w:r>
+    </w:p>
+    <w:p>
+      <w:pPr>
+        <w:rPr>
+          <w:sz w:val="24"/>
+        </w:rPr>
+      </w:pPr>
+      <w:r>
+        <w:rPr>
+          <w:sz w:val="24"/>
+          <w:szCs w:val="24"/>
+        </w:rPr>
+        <w:t xml:space="preserve">AI-based assistants were used while developing the code and while drafting parts of this report. All experiments were run on the project's own data, and every number, table and figure in the report is produced from result files saved in the project repository.</w:t>
       </w:r>
     </w:p>
     <w:p>
@@ -865,7 +873,7 @@
           <w:sz w:val="24"/>
           <w:szCs w:val="24"/>
         </w:rPr>
-        <w:t xml:space="preserve">The rapid improvement of generative AI has made it increasingly difficult to judge whether digital content is authentic. AI-generated text can be rewritten to avoid common detectors, while manipulated or synthetic images may contain only weak visual artifacts. In a forensic setting a single probability score is not sufficient: an analyst needs to know what evidence was examined, how reliable the result is, and why the system reached its conclusion.</w:t>
+        <w:t xml:space="preserve">Generative models now make it hard to tell authentic content from synthetic. Machine-written text can be paraphrased to slip past detectors, and manipulated images may carry only faint artefacts. A forensic examiner therefore needs more than a score: they need to know what was checked, how far the result can be trusted and why a conclusion was reached.</w:t>
       </w:r>
     </w:p>
     <w:p>
@@ -879,7 +887,7 @@
           <w:sz w:val="24"/>
           <w:szCs w:val="24"/>
         </w:rPr>
-        <w:t xml:space="preserve">This project presents an Agentic AI and Retrieval-Augmented Generation (RAG) based framework for digital forensics that examines text and images. Several independent tools score each input: a DeBERTa-v3 classifier and a Binoculars statistical probe for text, an EfficientNet-B4 network with Grad-CAM and CLIP-based probes for images, and optional language-model judges. A LangGraph orchestrator routes each case, a scope guard decides which image tools apply, a ChromaDB knowledge base supplies cited reference material, and a verifier combines calibrated scores, detects disagreement and refers uncertain cases to a human. Every case is stored as an audit record with a SHA-256 hash of the input. The system runs behind a FastAPI service with a purpose-built web interface, and is covered by 81 automated tests and a continuous-integration pipeline.</w:t>
+        <w:t xml:space="preserve">The project builds a digital-forensics framework around an agentic controller and retrieval-augmented generation (RAG), and applies it to text and images. Several independent tools score each input: a DeBERTa-v3 classifier and a Binoculars statistical probe for text, an EfficientNet-B4 network with Grad-CAM and CLIP-based probes for images, and optional language-model judges. A LangGraph orchestrator routes each case, a scope guard decides which image tools apply, a ChromaDB knowledge base supplies cited reference material, and a verifier combines calibrated scores, detects disagreement and refers uncertain cases to a human. Every case is stored as an audit record with a SHA-256 hash of the input. The system runs behind a FastAPI service with a purpose-built web interface, and is covered by 81 automated tests and a continuous-integration pipeline.</w:t>
       </w:r>
     </w:p>
     <w:p>
@@ -1458,7 +1466,7 @@
                 <w:sz w:val="21"/>
                 <w:szCs w:val="21"/>
               </w:rPr>
-              <w:t xml:space="preserve">7</w:t>
+              <w:t xml:space="preserve">6</w:t>
             </w:r>
           </w:p>
         </w:tc>
@@ -1980,7 +1988,7 @@
                 <w:sz w:val="21"/>
                 <w:szCs w:val="21"/>
               </w:rPr>
-              <w:t xml:space="preserve">11</w:t>
+              <w:t xml:space="preserve">10</w:t>
             </w:r>
           </w:p>
         </w:tc>
@@ -2067,7 +2075,7 @@
                 <w:sz w:val="21"/>
                 <w:szCs w:val="21"/>
               </w:rPr>
-              <w:t xml:space="preserve">12</w:t>
+              <w:t xml:space="preserve">11</w:t>
             </w:r>
           </w:p>
         </w:tc>
@@ -2154,7 +2162,7 @@
                 <w:sz w:val="21"/>
                 <w:szCs w:val="21"/>
               </w:rPr>
-              <w:t xml:space="preserve">12</w:t>
+              <w:t xml:space="preserve">11</w:t>
             </w:r>
           </w:p>
         </w:tc>
@@ -2241,7 +2249,7 @@
                 <w:sz w:val="21"/>
                 <w:szCs w:val="21"/>
               </w:rPr>
-              <w:t xml:space="preserve">13</w:t>
+              <w:t xml:space="preserve">12</w:t>
             </w:r>
           </w:p>
         </w:tc>
@@ -2328,7 +2336,7 @@
                 <w:sz w:val="21"/>
                 <w:szCs w:val="21"/>
               </w:rPr>
-              <w:t xml:space="preserve">13</w:t>
+              <w:t xml:space="preserve">12</w:t>
             </w:r>
           </w:p>
         </w:tc>
@@ -2415,7 +2423,7 @@
                 <w:sz w:val="21"/>
                 <w:szCs w:val="21"/>
               </w:rPr>
-              <w:t xml:space="preserve">13</w:t>
+              <w:t xml:space="preserve">12</w:t>
             </w:r>
           </w:p>
         </w:tc>
@@ -2502,7 +2510,7 @@
                 <w:sz w:val="21"/>
                 <w:szCs w:val="21"/>
               </w:rPr>
-              <w:t xml:space="preserve">14</w:t>
+              <w:t xml:space="preserve">13</w:t>
             </w:r>
           </w:p>
         </w:tc>
@@ -2589,7 +2597,7 @@
                 <w:sz w:val="21"/>
                 <w:szCs w:val="21"/>
               </w:rPr>
-              <w:t xml:space="preserve">14</w:t>
+              <w:t xml:space="preserve">13</w:t>
             </w:r>
           </w:p>
         </w:tc>
@@ -2676,7 +2684,7 @@
                 <w:sz w:val="21"/>
                 <w:szCs w:val="21"/>
               </w:rPr>
-              <w:t xml:space="preserve">16</w:t>
+              <w:t xml:space="preserve">15</w:t>
             </w:r>
           </w:p>
         </w:tc>
@@ -2763,7 +2771,7 @@
                 <w:sz w:val="21"/>
                 <w:szCs w:val="21"/>
               </w:rPr>
-              <w:t xml:space="preserve">16</w:t>
+              <w:t xml:space="preserve">15</w:t>
             </w:r>
           </w:p>
         </w:tc>
@@ -2850,7 +2858,7 @@
                 <w:sz w:val="21"/>
                 <w:szCs w:val="21"/>
               </w:rPr>
-              <w:t xml:space="preserve">16</w:t>
+              <w:t xml:space="preserve">15</w:t>
             </w:r>
           </w:p>
         </w:tc>
@@ -2937,7 +2945,7 @@
                 <w:sz w:val="21"/>
                 <w:szCs w:val="21"/>
               </w:rPr>
-              <w:t xml:space="preserve">16</w:t>
+              <w:t xml:space="preserve">15</w:t>
             </w:r>
           </w:p>
         </w:tc>
@@ -3024,7 +3032,7 @@
                 <w:sz w:val="21"/>
                 <w:szCs w:val="21"/>
               </w:rPr>
-              <w:t xml:space="preserve">17</w:t>
+              <w:t xml:space="preserve">16</w:t>
             </w:r>
           </w:p>
         </w:tc>
@@ -3111,7 +3119,7 @@
                 <w:sz w:val="21"/>
                 <w:szCs w:val="21"/>
               </w:rPr>
-              <w:t xml:space="preserve">19</w:t>
+              <w:t xml:space="preserve">18</w:t>
             </w:r>
           </w:p>
         </w:tc>
@@ -3198,7 +3206,7 @@
                 <w:sz w:val="21"/>
                 <w:szCs w:val="21"/>
               </w:rPr>
-              <w:t xml:space="preserve">19</w:t>
+              <w:t xml:space="preserve">18</w:t>
             </w:r>
           </w:p>
         </w:tc>
@@ -3285,7 +3293,7 @@
                 <w:sz w:val="21"/>
                 <w:szCs w:val="21"/>
               </w:rPr>
-              <w:t xml:space="preserve">19</w:t>
+              <w:t xml:space="preserve">18</w:t>
             </w:r>
           </w:p>
         </w:tc>
@@ -3372,7 +3380,7 @@
                 <w:sz w:val="21"/>
                 <w:szCs w:val="21"/>
               </w:rPr>
-              <w:t xml:space="preserve">20</w:t>
+              <w:t xml:space="preserve">19</w:t>
             </w:r>
           </w:p>
         </w:tc>
@@ -3459,7 +3467,7 @@
                 <w:sz w:val="21"/>
                 <w:szCs w:val="21"/>
               </w:rPr>
-              <w:t xml:space="preserve">21</w:t>
+              <w:t xml:space="preserve">20</w:t>
             </w:r>
           </w:p>
         </w:tc>
@@ -3546,7 +3554,7 @@
                 <w:sz w:val="21"/>
                 <w:szCs w:val="21"/>
               </w:rPr>
-              <w:t xml:space="preserve">21</w:t>
+              <w:t xml:space="preserve">20</w:t>
             </w:r>
           </w:p>
         </w:tc>
@@ -3633,7 +3641,7 @@
                 <w:sz w:val="21"/>
                 <w:szCs w:val="21"/>
               </w:rPr>
-              <w:t xml:space="preserve">22</w:t>
+              <w:t xml:space="preserve">21</w:t>
             </w:r>
           </w:p>
         </w:tc>
@@ -3720,7 +3728,7 @@
                 <w:sz w:val="21"/>
                 <w:szCs w:val="21"/>
               </w:rPr>
-              <w:t xml:space="preserve">23</w:t>
+              <w:t xml:space="preserve">22</w:t>
             </w:r>
           </w:p>
         </w:tc>
@@ -3807,7 +3815,7 @@
                 <w:sz w:val="21"/>
                 <w:szCs w:val="21"/>
               </w:rPr>
-              <w:t xml:space="preserve">23</w:t>
+              <w:t xml:space="preserve">22</w:t>
             </w:r>
           </w:p>
         </w:tc>
@@ -3894,7 +3902,7 @@
                 <w:sz w:val="21"/>
                 <w:szCs w:val="21"/>
               </w:rPr>
-              <w:t xml:space="preserve">23</w:t>
+              <w:t xml:space="preserve">22</w:t>
             </w:r>
           </w:p>
         </w:tc>
@@ -3981,7 +3989,7 @@
                 <w:sz w:val="21"/>
                 <w:szCs w:val="21"/>
               </w:rPr>
-              <w:t xml:space="preserve">23</w:t>
+              <w:t xml:space="preserve">22</w:t>
             </w:r>
           </w:p>
         </w:tc>
@@ -4068,7 +4076,7 @@
                 <w:sz w:val="21"/>
                 <w:szCs w:val="21"/>
               </w:rPr>
-              <w:t xml:space="preserve">24</w:t>
+              <w:t xml:space="preserve">23</w:t>
             </w:r>
           </w:p>
         </w:tc>
@@ -4151,7 +4159,6 @@
       <w:pPr>
         <w:rPr>
           <w:sz w:val="24"/>
-          <w:szCs w:val="24"/>
         </w:rPr>
       </w:pPr>
       <w:r>
@@ -4159,14 +4166,13 @@
           <w:sz w:val="24"/>
           <w:szCs w:val="24"/>
         </w:rPr>
-        <w:t>Digital evidence is no longer limited to photographs captured by cameras or documents written entirely by people. Modern generative models can produce fluent text, photorealistic faces and convincing edited media at very low cost. This creates a difficult problem for digital forensics: authenticity can no longer be judged reliably from appearance alone.</w:t>
+        <w:t xml:space="preserve">Evidence handled in investigations now includes material that no camera or person produced. Language models write fluent essays, and image generators and face-swapping tools produce portraits that pass casual inspection. For an examiner this removes a basic assumption: how a document or picture looks no longer says where it came from.</w:t>
       </w:r>
     </w:p>
     <w:p>
       <w:pPr>
         <w:rPr>
           <w:sz w:val="24"/>
-          <w:szCs w:val="24"/>
         </w:rPr>
       </w:pPr>
       <w:r>
@@ -4174,14 +4180,13 @@
           <w:sz w:val="24"/>
           <w:szCs w:val="24"/>
         </w:rPr>
-        <w:t>Most existing detection systems are built around a single classifier. Such a model may perform well on data similar to its training set but can lose accuracy when the generator, writing domain, image compression or manipulation method changes. RAID, for example, was created specifically to test machine-generated text detectors across models, domains, decoding settings and adversarial attacks, and its results show that robustness remains a major challenge [1]. FaceForensics++ similarly established large-scale benchmarking for manipulated facial imagery and demonstrated the importance of testing under different manipulation and compression conditions [4].</w:t>
+        <w:t xml:space="preserve">Most published detectors are a single trained classifier. They score well on data that resembles their training set and then weaken when the text generator, the writing domain, the compression level or the manipulation method changes. We saw this in our own early models (Section 2.2), and benchmarks such as RAID for text [1] and FaceForensics++ for faces [4] exist because such drops are common.</w:t>
       </w:r>
     </w:p>
     <w:p>
       <w:pPr>
         <w:rPr>
           <w:sz w:val="24"/>
-          <w:szCs w:val="24"/>
         </w:rPr>
       </w:pPr>
       <w:r>
@@ -4189,7 +4194,7 @@
           <w:sz w:val="24"/>
           <w:szCs w:val="24"/>
         </w:rPr>
-        <w:t>The proposed project approaches the problem as an investigation rather than a one-step classification task. Multiple detectors provide independent signals, an agentic layer decides how those tools should be used, RAG supplies relevant external forensic knowledge, and a verifier checks whether the available evidence supports a confident conclusion.</w:t>
+        <w:t xml:space="preserve">We therefore treat the task as an examination, not a single prediction. Independent tools each give a reading, a controller decides how the readings are gathered and combined, retrieved reference notes give the result something citable to rest on, and a verifier asks whether the readings agree well enough to report.</w:t>
       </w:r>
     </w:p>
     <w:p>
@@ -4295,7 +4300,7 @@
           <w:sz w:val="24"/>
           <w:szCs w:val="24"/>
         </w:rPr>
-        <w:t>AI-generated content is becoming easier to create and harder to identify by visual inspection alone.</w:t>
+        <w:t xml:space="preserve">Generated content is cheap to produce and often cannot be recognised by eye.</w:t>
       </w:r>
     </w:p>
     <w:p>
@@ -4311,7 +4316,7 @@
           <w:sz w:val="24"/>
           <w:szCs w:val="24"/>
         </w:rPr>
-        <w:t>A single detector can be brittle when evaluated on unseen generators, domains or post-processing conditions.</w:t>
+        <w:t xml:space="preserve">A detector trained on one source can fail without warning on another generator, domain or compression level.</w:t>
       </w:r>
     </w:p>
     <w:p>
@@ -4327,7 +4332,7 @@
           <w:sz w:val="24"/>
           <w:szCs w:val="24"/>
         </w:rPr>
-        <w:t>Forensic use requires an explanation and supporting evidence, not only a real/fake probability.</w:t>
+        <w:t xml:space="preserve">An investigator needs the evidence and the reliability of a result, not only a real-or-fake probability.</w:t>
       </w:r>
     </w:p>
     <w:p>
@@ -4343,7 +4348,7 @@
           <w:sz w:val="24"/>
           <w:szCs w:val="24"/>
         </w:rPr>
-        <w:t>Text and image evidence exhibit different kinds of artifacts, so a modular multi-tool design is more practical than one monolithic model.</w:t>
+        <w:t xml:space="preserve">Text and images fail in different ways, so separate specialist tools suit the problem better than one model for everything.</w:t>
       </w:r>
     </w:p>
     <w:p>
@@ -4359,7 +4364,7 @@
           <w:sz w:val="24"/>
           <w:szCs w:val="24"/>
         </w:rPr>
-        <w:t>Agentic orchestration offers a way to select tools, re-check uncertain cases and escalate evidence that cannot be resolved automatically.</w:t>
+        <w:t xml:space="preserve">A control layer can choose tools, repeat a doubtful check and pass unresolved cases to a person.</w:t>
       </w:r>
     </w:p>
     <w:p>
@@ -4382,7 +4387,6 @@
       <w:pPr>
         <w:rPr>
           <w:sz w:val="24"/>
-          <w:szCs w:val="24"/>
         </w:rPr>
       </w:pPr>
       <w:r>
@@ -4390,7 +4394,7 @@
           <w:sz w:val="24"/>
           <w:szCs w:val="24"/>
         </w:rPr>
-        <w:t>The problem addressed in this project is to design an end-to-end digital forensics framework that can examine AI-generated or manipulated text and images using complementary forensic methods, combine their outputs in a controlled manner, retrieve relevant supporting knowledge, and produce an explainable confidence-aware verdict. The system should avoid treating any single model as an unquestionable source and should explicitly identify cases that require human review.</w:t>
+        <w:t xml:space="preserve">The aim is a complete forensic workflow for text and images. It should run several different detection methods on the same material, merge their outputs under explicit rules, retrieve supporting reference knowledge, and return a verdict with a confidence value and an explanation. No single model is to be treated as final authority, and cases the tools cannot settle must be identified for a human examiner.</w:t>
       </w:r>
     </w:p>
     <w:p>
@@ -4422,7 +4426,7 @@
           <w:sz w:val="24"/>
           <w:szCs w:val="24"/>
         </w:rPr>
-        <w:t>Digital evidence screening in cybercrime and forensic investigations.</w:t>
+        <w:t xml:space="preserve">Screening of digital evidence in cybercrime cases.</w:t>
       </w:r>
     </w:p>
     <w:p>
@@ -4438,7 +4442,7 @@
           <w:sz w:val="24"/>
           <w:szCs w:val="24"/>
         </w:rPr>
-        <w:t>Newsroom and fact-checking workflows for suspicious text and imagery.</w:t>
+        <w:t xml:space="preserve">Checking suspicious text and images in newsrooms and fact-checking desks.</w:t>
       </w:r>
     </w:p>
     <w:p>
@@ -4454,7 +4458,7 @@
           <w:sz w:val="24"/>
           <w:szCs w:val="24"/>
         </w:rPr>
-        <w:t>KYC, impersonation and identity-fraud investigations involving manipulated facial media.</w:t>
+        <w:t xml:space="preserve">Identity-fraud and KYC cases where a face may have been swapped or synthesised.</w:t>
       </w:r>
     </w:p>
     <w:p>
@@ -4470,8 +4474,7 @@
           <w:sz w:val="24"/>
           <w:szCs w:val="24"/>
         </w:rPr>
-        <w:lastRenderedPageBreak/>
-        <w:t>Enterprise media verification and content provenance workflows.</w:t>
+        <w:t xml:space="preserve">Media verification and provenance checks inside organisations.</w:t>
       </w:r>
     </w:p>
     <w:p>
@@ -4487,7 +4490,7 @@
           <w:sz w:val="24"/>
           <w:szCs w:val="24"/>
         </w:rPr>
-        <w:t>Academic and publishing contexts where machine-generated text requires screening.</w:t>
+        <w:t xml:space="preserve">Detection of machine-written text in academic and publishing workflows.</w:t>
       </w:r>
     </w:p>
     <w:p>
@@ -4503,7 +4506,7 @@
           <w:sz w:val="24"/>
           <w:szCs w:val="24"/>
         </w:rPr>
-        <w:t>Future extension to video deepfake analysis and invisible watermark/provenance services.</w:t>
+        <w:t xml:space="preserve">Later extension to video and to watermark-based provenance.</w:t>
       </w:r>
     </w:p>
     <w:p>
@@ -5287,7 +5290,7 @@
           <w:sz w:val="24"/>
           <w:szCs w:val="24"/>
         </w:rPr>
-        <w:t xml:space="preserve">RAID contains more than six million machine-generated samples across 11 models, eight domains, 11 adversarial attacks and four decoding strategies [1]. WildDeepfake and FaceForensics++ provide in-the-wild and controlled manipulation data respectively [4], [5]. The face-swap sets were converted to face crops with MTCNN so that all sources share one preprocessing; FaceForensics++ is the C32 compression level, not C23. Face2Face and FaceShifter were never used in training and form the zero-shot test.</w:t>
+        <w:t xml:space="preserve">RAID is very large (over six million machine-generated texts) and varies the generator (11), the domain (8), the adversarial attack (11) and the decoding strategy (4) [1]. WildDeepfake supplies internet-collected deepfakes and FaceForensics++ supplies controlled manipulations [4], [5]. The face-swap sets were converted to face crops with MTCNN so that all sources share one preprocessing; FaceForensics++ is the C32 compression level, not C23. Face2Face and FaceShifter were never used in training and form the zero-shot test.</w:t>
       </w:r>
     </w:p>
     <w:p>
@@ -5332,7 +5335,7 @@
           <w:sz w:val="24"/>
           <w:szCs w:val="24"/>
         </w:rPr>
-        <w:t xml:space="preserve">To design and develop an Agentic AI and RAG-based digital forensics framework for detecting AI-generated or manipulated text and images using multiple complementary forensic techniques, while producing explainable, evidence-grounded and confidence-aware reports.</w:t>
+        <w:t xml:space="preserve">To build a framework that uses an agentic controller and retrieval-augmented generation to judge whether text or images are machine-generated or manipulated. Several complementary detection techniques are combined, and every report must be explainable, backed by retrieved evidence and honest about its confidence.</w:t>
       </w:r>
     </w:p>
     <w:tbl>
@@ -6339,1207 +6342,1559 @@
           <w:sz w:val="24"/>
           <w:szCs w:val="24"/>
         </w:rPr>
-        <w:t xml:space="preserve">The literature was reviewed across three connected areas: machine-generated text detection, image and deepfake forensics, and retrieval- and agent-based reasoning. The aim was to identify where different methods complement one another rather than to select a single best detector.</w:t>
+        <w:t xml:space="preserve">We read widely in three connected areas: detection of machine-written text, image and deepfake forensics, and retrieval- and agent-based reasoning. The goal was to see where methods supplement each other, not to pick one best detector.</w:t>
       </w:r>
     </w:p>
     <w:tbl>
       <w:tblPr>
         <w:tblStyle w:val="TableGrid"/>
-        <w:tblW w:w="0" w:type="auto"/>
+        <w:tblW w:w="9900" w:type="dxa"/>
         <w:jc w:val="center"/>
+        <w:tblLayout w:type="fixed"/>
         <w:tblLook w:val="04A0" w:firstRow="1" w:lastRow="0" w:firstColumn="1" w:lastColumn="0" w:noHBand="0" w:noVBand="1"/>
       </w:tblPr>
       <w:tblGrid>
-        <w:gridCol w:w="1208"/>
-        <w:gridCol w:w="1363"/>
-        <w:gridCol w:w="1419"/>
-        <w:gridCol w:w="1860"/>
-        <w:gridCol w:w="1575"/>
-        <w:gridCol w:w="2763"/>
+        <w:gridCol w:w="650"/>
+        <w:gridCol w:w="1500"/>
+        <w:gridCol w:w="1050"/>
+        <w:gridCol w:w="2500"/>
+        <w:gridCol w:w="2200"/>
+        <w:gridCol w:w="2000"/>
       </w:tblGrid>
       <w:tr>
         <w:trPr>
+          <w:cantSplit/>
+          <w:tblHeader/>
           <w:jc w:val="center"/>
         </w:trPr>
         <w:tc>
           <w:tcPr>
-            <w:tcW w:w="1656" w:type="dxa"/>
+            <w:tcW w:w="650" w:type="dxa"/>
             <w:shd w:val="clear" w:color="auto" w:fill="D9EAF7"/>
             <w:tcMar>
-              <w:top w:w="90" w:type="dxa"/>
-              <w:left w:w="90" w:type="dxa"/>
-              <w:bottom w:w="90" w:type="dxa"/>
-              <w:right w:w="90" w:type="dxa"/>
-            </w:tcMar>
-            <w:vAlign w:val="center"/>
-          </w:tcPr>
-          <w:p>
-            <w:pPr>
-              <w:rPr>
-                <w:sz w:val="24"/>
-                <w:szCs w:val="24"/>
-              </w:rPr>
-            </w:pPr>
-            <w:r>
-              <w:rPr>
-                <w:sz w:val="24"/>
-                <w:szCs w:val="24"/>
-              </w:rPr>
-              <w:t>Year</w:t>
-            </w:r>
-          </w:p>
-        </w:tc>
-        <w:tc>
-          <w:tcPr>
-            <w:tcW w:w="1656" w:type="dxa"/>
+              <w:top w:w="60" w:type="dxa"/>
+              <w:left w:w="80" w:type="dxa"/>
+              <w:bottom w:w="60" w:type="dxa"/>
+              <w:right w:w="80" w:type="dxa"/>
+            </w:tcMar>
+            <w:vAlign w:val="center"/>
+          </w:tcPr>
+          <w:p>
+            <w:pPr>
+              <w:spacing w:after="0"/>
+              <w:rPr>
+                <w:sz w:val="18"/>
+              </w:rPr>
+            </w:pPr>
+            <w:r>
+              <w:rPr>
+                <w:b/>
+                <w:sz w:val="18"/>
+                <w:szCs w:val="18"/>
+              </w:rPr>
+              <w:t xml:space="preserve">Year</w:t>
+            </w:r>
+          </w:p>
+        </w:tc>
+        <w:tc>
+          <w:tcPr>
+            <w:tcW w:w="1500" w:type="dxa"/>
             <w:shd w:val="clear" w:color="auto" w:fill="D9EAF7"/>
             <w:tcMar>
-              <w:top w:w="90" w:type="dxa"/>
-              <w:left w:w="90" w:type="dxa"/>
-              <w:bottom w:w="90" w:type="dxa"/>
-              <w:right w:w="90" w:type="dxa"/>
-            </w:tcMar>
-            <w:vAlign w:val="center"/>
-          </w:tcPr>
-          <w:p>
-            <w:pPr>
-              <w:rPr>
-                <w:sz w:val="24"/>
-                <w:szCs w:val="24"/>
-              </w:rPr>
-            </w:pPr>
-            <w:r>
-              <w:rPr>
-                <w:sz w:val="24"/>
-                <w:szCs w:val="24"/>
-              </w:rPr>
-              <w:t>Work</w:t>
-            </w:r>
-          </w:p>
-        </w:tc>
-        <w:tc>
-          <w:tcPr>
-            <w:tcW w:w="1656" w:type="dxa"/>
+              <w:top w:w="60" w:type="dxa"/>
+              <w:left w:w="80" w:type="dxa"/>
+              <w:bottom w:w="60" w:type="dxa"/>
+              <w:right w:w="80" w:type="dxa"/>
+            </w:tcMar>
+            <w:vAlign w:val="center"/>
+          </w:tcPr>
+          <w:p>
+            <w:pPr>
+              <w:spacing w:after="0"/>
+              <w:rPr>
+                <w:sz w:val="18"/>
+              </w:rPr>
+            </w:pPr>
+            <w:r>
+              <w:rPr>
+                <w:b/>
+                <w:sz w:val="18"/>
+                <w:szCs w:val="18"/>
+              </w:rPr>
+              <w:t xml:space="preserve">Work</w:t>
+            </w:r>
+          </w:p>
+        </w:tc>
+        <w:tc>
+          <w:tcPr>
+            <w:tcW w:w="1050" w:type="dxa"/>
             <w:shd w:val="clear" w:color="auto" w:fill="D9EAF7"/>
             <w:tcMar>
-              <w:top w:w="90" w:type="dxa"/>
-              <w:left w:w="90" w:type="dxa"/>
-              <w:bottom w:w="90" w:type="dxa"/>
-              <w:right w:w="90" w:type="dxa"/>
-            </w:tcMar>
-            <w:vAlign w:val="center"/>
-          </w:tcPr>
-          <w:p>
-            <w:pPr>
-              <w:rPr>
-                <w:sz w:val="24"/>
-                <w:szCs w:val="24"/>
-              </w:rPr>
-            </w:pPr>
-            <w:r>
-              <w:rPr>
-                <w:sz w:val="24"/>
-                <w:szCs w:val="24"/>
-              </w:rPr>
-              <w:t>Area</w:t>
-            </w:r>
-          </w:p>
-        </w:tc>
-        <w:tc>
-          <w:tcPr>
-            <w:tcW w:w="1656" w:type="dxa"/>
+              <w:top w:w="60" w:type="dxa"/>
+              <w:left w:w="80" w:type="dxa"/>
+              <w:bottom w:w="60" w:type="dxa"/>
+              <w:right w:w="80" w:type="dxa"/>
+            </w:tcMar>
+            <w:vAlign w:val="center"/>
+          </w:tcPr>
+          <w:p>
+            <w:pPr>
+              <w:spacing w:after="0"/>
+              <w:rPr>
+                <w:sz w:val="18"/>
+              </w:rPr>
+            </w:pPr>
+            <w:r>
+              <w:rPr>
+                <w:b/>
+                <w:sz w:val="18"/>
+                <w:szCs w:val="18"/>
+              </w:rPr>
+              <w:t xml:space="preserve">Area</w:t>
+            </w:r>
+          </w:p>
+        </w:tc>
+        <w:tc>
+          <w:tcPr>
+            <w:tcW w:w="2500" w:type="dxa"/>
             <w:shd w:val="clear" w:color="auto" w:fill="D9EAF7"/>
             <w:tcMar>
-              <w:top w:w="90" w:type="dxa"/>
-              <w:left w:w="90" w:type="dxa"/>
-              <w:bottom w:w="90" w:type="dxa"/>
-              <w:right w:w="90" w:type="dxa"/>
-            </w:tcMar>
-            <w:vAlign w:val="center"/>
-          </w:tcPr>
-          <w:p>
-            <w:pPr>
-              <w:rPr>
-                <w:sz w:val="24"/>
-                <w:szCs w:val="24"/>
-              </w:rPr>
-            </w:pPr>
-            <w:r>
-              <w:rPr>
-                <w:sz w:val="24"/>
-                <w:szCs w:val="24"/>
-              </w:rPr>
-              <w:t>Method / Contribution</w:t>
-            </w:r>
-          </w:p>
-        </w:tc>
-        <w:tc>
-          <w:tcPr>
-            <w:tcW w:w="1656" w:type="dxa"/>
+              <w:top w:w="60" w:type="dxa"/>
+              <w:left w:w="80" w:type="dxa"/>
+              <w:bottom w:w="60" w:type="dxa"/>
+              <w:right w:w="80" w:type="dxa"/>
+            </w:tcMar>
+            <w:vAlign w:val="center"/>
+          </w:tcPr>
+          <w:p>
+            <w:pPr>
+              <w:spacing w:after="0"/>
+              <w:rPr>
+                <w:sz w:val="18"/>
+              </w:rPr>
+            </w:pPr>
+            <w:r>
+              <w:rPr>
+                <w:b/>
+                <w:sz w:val="18"/>
+                <w:szCs w:val="18"/>
+              </w:rPr>
+              <w:t xml:space="preserve">Contribution</w:t>
+            </w:r>
+          </w:p>
+        </w:tc>
+        <w:tc>
+          <w:tcPr>
+            <w:tcW w:w="2200" w:type="dxa"/>
             <w:shd w:val="clear" w:color="auto" w:fill="D9EAF7"/>
             <w:tcMar>
-              <w:top w:w="90" w:type="dxa"/>
-              <w:left w:w="90" w:type="dxa"/>
-              <w:bottom w:w="90" w:type="dxa"/>
-              <w:right w:w="90" w:type="dxa"/>
-            </w:tcMar>
-            <w:vAlign w:val="center"/>
-          </w:tcPr>
-          <w:p>
-            <w:pPr>
-              <w:rPr>
-                <w:sz w:val="24"/>
-                <w:szCs w:val="24"/>
-              </w:rPr>
-            </w:pPr>
-            <w:r>
-              <w:rPr>
-                <w:sz w:val="24"/>
-                <w:szCs w:val="24"/>
-              </w:rPr>
-              <w:t>Useful finding</w:t>
-            </w:r>
-          </w:p>
-        </w:tc>
-        <w:tc>
-          <w:tcPr>
-            <w:tcW w:w="1656" w:type="dxa"/>
+              <w:top w:w="60" w:type="dxa"/>
+              <w:left w:w="80" w:type="dxa"/>
+              <w:bottom w:w="60" w:type="dxa"/>
+              <w:right w:w="80" w:type="dxa"/>
+            </w:tcMar>
+            <w:vAlign w:val="center"/>
+          </w:tcPr>
+          <w:p>
+            <w:pPr>
+              <w:spacing w:after="0"/>
+              <w:rPr>
+                <w:sz w:val="18"/>
+              </w:rPr>
+            </w:pPr>
+            <w:r>
+              <w:rPr>
+                <w:b/>
+                <w:sz w:val="18"/>
+                <w:szCs w:val="18"/>
+              </w:rPr>
+              <w:t xml:space="preserve">Finding relied on</w:t>
+            </w:r>
+          </w:p>
+        </w:tc>
+        <w:tc>
+          <w:tcPr>
+            <w:tcW w:w="2000" w:type="dxa"/>
             <w:shd w:val="clear" w:color="auto" w:fill="D9EAF7"/>
             <w:tcMar>
-              <w:top w:w="90" w:type="dxa"/>
-              <w:left w:w="90" w:type="dxa"/>
-              <w:bottom w:w="90" w:type="dxa"/>
-              <w:right w:w="90" w:type="dxa"/>
-            </w:tcMar>
-            <w:vAlign w:val="center"/>
-          </w:tcPr>
-          <w:p>
-            <w:pPr>
-              <w:rPr>
-                <w:sz w:val="24"/>
-                <w:szCs w:val="24"/>
-              </w:rPr>
-            </w:pPr>
-            <w:r>
-              <w:rPr>
-                <w:sz w:val="24"/>
-                <w:szCs w:val="24"/>
-              </w:rPr>
-              <w:t>Limitation / gap</w:t>
+              <w:top w:w="60" w:type="dxa"/>
+              <w:left w:w="80" w:type="dxa"/>
+              <w:bottom w:w="60" w:type="dxa"/>
+              <w:right w:w="80" w:type="dxa"/>
+            </w:tcMar>
+            <w:vAlign w:val="center"/>
+          </w:tcPr>
+          <w:p>
+            <w:pPr>
+              <w:spacing w:after="0"/>
+              <w:rPr>
+                <w:sz w:val="18"/>
+              </w:rPr>
+            </w:pPr>
+            <w:r>
+              <w:rPr>
+                <w:b/>
+                <w:sz w:val="18"/>
+                <w:szCs w:val="18"/>
+              </w:rPr>
+              <w:t xml:space="preserve">Limitation</w:t>
             </w:r>
           </w:p>
         </w:tc>
       </w:tr>
       <w:tr>
         <w:trPr>
+          <w:cantSplit/>
           <w:jc w:val="center"/>
         </w:trPr>
         <w:tc>
           <w:tcPr>
-            <w:tcW w:w="1656" w:type="dxa"/>
-          </w:tcPr>
-          <w:p>
-            <w:pPr>
-              <w:rPr>
-                <w:sz w:val="24"/>
-                <w:szCs w:val="24"/>
-              </w:rPr>
-            </w:pPr>
-            <w:r>
-              <w:rPr>
-                <w:sz w:val="24"/>
-                <w:szCs w:val="24"/>
-              </w:rPr>
-              <w:t>2019</w:t>
-            </w:r>
-          </w:p>
-        </w:tc>
-        <w:tc>
-          <w:tcPr>
-            <w:tcW w:w="1656" w:type="dxa"/>
-          </w:tcPr>
-          <w:p>
-            <w:pPr>
-              <w:rPr>
-                <w:sz w:val="24"/>
-                <w:szCs w:val="24"/>
-              </w:rPr>
-            </w:pPr>
-            <w:r>
-              <w:rPr>
-                <w:sz w:val="24"/>
-                <w:szCs w:val="24"/>
-              </w:rPr>
-              <w:t>Rössler et al. [4]</w:t>
-            </w:r>
-          </w:p>
-        </w:tc>
-        <w:tc>
-          <w:tcPr>
-            <w:tcW w:w="1656" w:type="dxa"/>
-          </w:tcPr>
-          <w:p>
-            <w:pPr>
-              <w:rPr>
-                <w:sz w:val="24"/>
-                <w:szCs w:val="24"/>
-              </w:rPr>
-            </w:pPr>
-            <w:r>
-              <w:rPr>
-                <w:sz w:val="24"/>
-                <w:szCs w:val="24"/>
-              </w:rPr>
-              <w:t>Image</w:t>
-            </w:r>
-          </w:p>
-        </w:tc>
-        <w:tc>
-          <w:tcPr>
-            <w:tcW w:w="1656" w:type="dxa"/>
-          </w:tcPr>
-          <w:p>
-            <w:pPr>
-              <w:rPr>
-                <w:sz w:val="24"/>
-                <w:szCs w:val="24"/>
-              </w:rPr>
-            </w:pPr>
-            <w:r>
-              <w:rPr>
-                <w:sz w:val="24"/>
-                <w:szCs w:val="24"/>
-              </w:rPr>
-              <w:t>FaceForensics++ benchmark; data-driven forgery detection</w:t>
-            </w:r>
-          </w:p>
-        </w:tc>
-        <w:tc>
-          <w:tcPr>
-            <w:tcW w:w="1656" w:type="dxa"/>
-          </w:tcPr>
-          <w:p>
-            <w:pPr>
-              <w:rPr>
-                <w:sz w:val="24"/>
-                <w:szCs w:val="24"/>
-              </w:rPr>
-            </w:pPr>
-            <w:r>
-              <w:rPr>
-                <w:sz w:val="24"/>
-                <w:szCs w:val="24"/>
-              </w:rPr>
-              <w:t>Large controlled benchmark for facial manipulation</w:t>
-            </w:r>
-          </w:p>
-        </w:tc>
-        <w:tc>
-          <w:tcPr>
-            <w:tcW w:w="1656" w:type="dxa"/>
-          </w:tcPr>
-          <w:p>
-            <w:pPr>
-              <w:rPr>
-                <w:sz w:val="24"/>
-                <w:szCs w:val="24"/>
-              </w:rPr>
-            </w:pPr>
-            <w:r>
-              <w:rPr>
-                <w:sz w:val="24"/>
-                <w:szCs w:val="24"/>
-              </w:rPr>
-              <w:t>Performance depends on manipulation/compression distribution</w:t>
+            <w:tcW w:w="650" w:type="dxa"/>
+            <w:tcMar>
+              <w:top w:w="60" w:type="dxa"/>
+              <w:left w:w="80" w:type="dxa"/>
+              <w:bottom w:w="60" w:type="dxa"/>
+              <w:right w:w="80" w:type="dxa"/>
+            </w:tcMar>
+            <w:vAlign w:val="center"/>
+          </w:tcPr>
+          <w:p>
+            <w:pPr>
+              <w:spacing w:after="0"/>
+              <w:rPr>
+                <w:sz w:val="18"/>
+              </w:rPr>
+            </w:pPr>
+            <w:r>
+              <w:rPr>
+                <w:sz w:val="18"/>
+                <w:szCs w:val="18"/>
+              </w:rPr>
+              <w:t xml:space="preserve">2019</w:t>
+            </w:r>
+          </w:p>
+        </w:tc>
+        <w:tc>
+          <w:tcPr>
+            <w:tcW w:w="1500" w:type="dxa"/>
+            <w:tcMar>
+              <w:top w:w="60" w:type="dxa"/>
+              <w:left w:w="80" w:type="dxa"/>
+              <w:bottom w:w="60" w:type="dxa"/>
+              <w:right w:w="80" w:type="dxa"/>
+            </w:tcMar>
+            <w:vAlign w:val="center"/>
+          </w:tcPr>
+          <w:p>
+            <w:pPr>
+              <w:spacing w:after="0"/>
+              <w:rPr>
+                <w:sz w:val="18"/>
+              </w:rPr>
+            </w:pPr>
+            <w:r>
+              <w:rPr>
+                <w:sz w:val="18"/>
+                <w:szCs w:val="18"/>
+              </w:rPr>
+              <w:t xml:space="preserve">Rössler et al. [4]</w:t>
+            </w:r>
+          </w:p>
+        </w:tc>
+        <w:tc>
+          <w:tcPr>
+            <w:tcW w:w="1050" w:type="dxa"/>
+            <w:tcMar>
+              <w:top w:w="60" w:type="dxa"/>
+              <w:left w:w="80" w:type="dxa"/>
+              <w:bottom w:w="60" w:type="dxa"/>
+              <w:right w:w="80" w:type="dxa"/>
+            </w:tcMar>
+            <w:vAlign w:val="center"/>
+          </w:tcPr>
+          <w:p>
+            <w:pPr>
+              <w:spacing w:after="0"/>
+              <w:rPr>
+                <w:sz w:val="18"/>
+              </w:rPr>
+            </w:pPr>
+            <w:r>
+              <w:rPr>
+                <w:sz w:val="18"/>
+                <w:szCs w:val="18"/>
+              </w:rPr>
+              <w:t xml:space="preserve">Image</w:t>
+            </w:r>
+          </w:p>
+        </w:tc>
+        <w:tc>
+          <w:tcPr>
+            <w:tcW w:w="2500" w:type="dxa"/>
+            <w:tcMar>
+              <w:top w:w="60" w:type="dxa"/>
+              <w:left w:w="80" w:type="dxa"/>
+              <w:bottom w:w="60" w:type="dxa"/>
+              <w:right w:w="80" w:type="dxa"/>
+            </w:tcMar>
+            <w:vAlign w:val="center"/>
+          </w:tcPr>
+          <w:p>
+            <w:pPr>
+              <w:spacing w:after="0"/>
+              <w:rPr>
+                <w:sz w:val="18"/>
+              </w:rPr>
+            </w:pPr>
+            <w:r>
+              <w:rPr>
+                <w:sz w:val="18"/>
+                <w:szCs w:val="18"/>
+              </w:rPr>
+              <w:t xml:space="preserve">Large benchmark of facial manipulations at several compression levels</w:t>
+            </w:r>
+          </w:p>
+        </w:tc>
+        <w:tc>
+          <w:tcPr>
+            <w:tcW w:w="2200" w:type="dxa"/>
+            <w:tcMar>
+              <w:top w:w="60" w:type="dxa"/>
+              <w:left w:w="80" w:type="dxa"/>
+              <w:bottom w:w="60" w:type="dxa"/>
+              <w:right w:w="80" w:type="dxa"/>
+            </w:tcMar>
+            <w:vAlign w:val="center"/>
+          </w:tcPr>
+          <w:p>
+            <w:pPr>
+              <w:spacing w:after="0"/>
+              <w:rPr>
+                <w:sz w:val="18"/>
+              </w:rPr>
+            </w:pPr>
+            <w:r>
+              <w:rPr>
+                <w:sz w:val="18"/>
+                <w:szCs w:val="18"/>
+              </w:rPr>
+              <w:t xml:space="preserve">Detectors can be compared under controlled, repeatable conditions</w:t>
+            </w:r>
+          </w:p>
+        </w:tc>
+        <w:tc>
+          <w:tcPr>
+            <w:tcW w:w="2000" w:type="dxa"/>
+            <w:tcMar>
+              <w:top w:w="60" w:type="dxa"/>
+              <w:left w:w="80" w:type="dxa"/>
+              <w:bottom w:w="60" w:type="dxa"/>
+              <w:right w:w="80" w:type="dxa"/>
+            </w:tcMar>
+            <w:vAlign w:val="center"/>
+          </w:tcPr>
+          <w:p>
+            <w:pPr>
+              <w:spacing w:after="0"/>
+              <w:rPr>
+                <w:sz w:val="18"/>
+              </w:rPr>
+            </w:pPr>
+            <w:r>
+              <w:rPr>
+                <w:sz w:val="18"/>
+                <w:szCs w:val="18"/>
+              </w:rPr>
+              <w:t xml:space="preserve">Results depend on the manipulation methods and compression included</w:t>
             </w:r>
           </w:p>
         </w:tc>
       </w:tr>
       <w:tr>
         <w:trPr>
+          <w:cantSplit/>
           <w:jc w:val="center"/>
         </w:trPr>
         <w:tc>
           <w:tcPr>
-            <w:tcW w:w="1656" w:type="dxa"/>
-          </w:tcPr>
-          <w:p>
-            <w:pPr>
-              <w:rPr>
-                <w:sz w:val="24"/>
-                <w:szCs w:val="24"/>
-              </w:rPr>
-            </w:pPr>
-            <w:r>
-              <w:rPr>
-                <w:sz w:val="24"/>
-                <w:szCs w:val="24"/>
-              </w:rPr>
-              <w:t>2020</w:t>
-            </w:r>
-          </w:p>
-        </w:tc>
-        <w:tc>
-          <w:tcPr>
-            <w:tcW w:w="1656" w:type="dxa"/>
-          </w:tcPr>
-          <w:p>
-            <w:pPr>
-              <w:rPr>
-                <w:sz w:val="24"/>
-                <w:szCs w:val="24"/>
-              </w:rPr>
-            </w:pPr>
-            <w:r>
-              <w:rPr>
-                <w:sz w:val="24"/>
-                <w:szCs w:val="24"/>
-              </w:rPr>
-              <w:t>Zi et al. [5]</w:t>
-            </w:r>
-          </w:p>
-        </w:tc>
-        <w:tc>
-          <w:tcPr>
-            <w:tcW w:w="1656" w:type="dxa"/>
-          </w:tcPr>
-          <w:p>
-            <w:pPr>
-              <w:rPr>
-                <w:sz w:val="24"/>
-                <w:szCs w:val="24"/>
-              </w:rPr>
-            </w:pPr>
-            <w:r>
-              <w:rPr>
-                <w:sz w:val="24"/>
-                <w:szCs w:val="24"/>
-              </w:rPr>
-              <w:t>Image</w:t>
-            </w:r>
-          </w:p>
-        </w:tc>
-        <w:tc>
-          <w:tcPr>
-            <w:tcW w:w="1656" w:type="dxa"/>
-          </w:tcPr>
-          <w:p>
-            <w:pPr>
-              <w:rPr>
-                <w:sz w:val="24"/>
-                <w:szCs w:val="24"/>
-              </w:rPr>
-            </w:pPr>
-            <w:r>
-              <w:rPr>
-                <w:sz w:val="24"/>
-                <w:szCs w:val="24"/>
-              </w:rPr>
-              <w:t>WildDeepfake real-world dataset; ADDNet baselines</w:t>
-            </w:r>
-          </w:p>
-        </w:tc>
-        <w:tc>
-          <w:tcPr>
-            <w:tcW w:w="1656" w:type="dxa"/>
-          </w:tcPr>
-          <w:p>
-            <w:pPr>
-              <w:rPr>
-                <w:sz w:val="24"/>
-                <w:szCs w:val="24"/>
-              </w:rPr>
-            </w:pPr>
-            <w:r>
-              <w:rPr>
-                <w:sz w:val="24"/>
-                <w:szCs w:val="24"/>
-              </w:rPr>
-              <w:t>Shows a harder in-the-wild setting</w:t>
-            </w:r>
-          </w:p>
-        </w:tc>
-        <w:tc>
-          <w:tcPr>
-            <w:tcW w:w="1656" w:type="dxa"/>
-          </w:tcPr>
-          <w:p>
-            <w:pPr>
-              <w:rPr>
-                <w:sz w:val="24"/>
-                <w:szCs w:val="24"/>
-              </w:rPr>
-            </w:pPr>
-            <w:r>
-              <w:rPr>
-                <w:sz w:val="24"/>
-                <w:szCs w:val="24"/>
-              </w:rPr>
-              <w:t>Still focused on deepfake detection rather than evidence reasoning</w:t>
+            <w:tcW w:w="650" w:type="dxa"/>
+            <w:tcMar>
+              <w:top w:w="60" w:type="dxa"/>
+              <w:left w:w="80" w:type="dxa"/>
+              <w:bottom w:w="60" w:type="dxa"/>
+              <w:right w:w="80" w:type="dxa"/>
+            </w:tcMar>
+            <w:vAlign w:val="center"/>
+          </w:tcPr>
+          <w:p>
+            <w:pPr>
+              <w:spacing w:after="0"/>
+              <w:rPr>
+                <w:sz w:val="18"/>
+              </w:rPr>
+            </w:pPr>
+            <w:r>
+              <w:rPr>
+                <w:sz w:val="18"/>
+                <w:szCs w:val="18"/>
+              </w:rPr>
+              <w:t xml:space="preserve">2020</w:t>
+            </w:r>
+          </w:p>
+        </w:tc>
+        <w:tc>
+          <w:tcPr>
+            <w:tcW w:w="1500" w:type="dxa"/>
+            <w:tcMar>
+              <w:top w:w="60" w:type="dxa"/>
+              <w:left w:w="80" w:type="dxa"/>
+              <w:bottom w:w="60" w:type="dxa"/>
+              <w:right w:w="80" w:type="dxa"/>
+            </w:tcMar>
+            <w:vAlign w:val="center"/>
+          </w:tcPr>
+          <w:p>
+            <w:pPr>
+              <w:spacing w:after="0"/>
+              <w:rPr>
+                <w:sz w:val="18"/>
+              </w:rPr>
+            </w:pPr>
+            <w:r>
+              <w:rPr>
+                <w:sz w:val="18"/>
+                <w:szCs w:val="18"/>
+              </w:rPr>
+              <w:t xml:space="preserve">Zi et al. [5]</w:t>
+            </w:r>
+          </w:p>
+        </w:tc>
+        <w:tc>
+          <w:tcPr>
+            <w:tcW w:w="1050" w:type="dxa"/>
+            <w:tcMar>
+              <w:top w:w="60" w:type="dxa"/>
+              <w:left w:w="80" w:type="dxa"/>
+              <w:bottom w:w="60" w:type="dxa"/>
+              <w:right w:w="80" w:type="dxa"/>
+            </w:tcMar>
+            <w:vAlign w:val="center"/>
+          </w:tcPr>
+          <w:p>
+            <w:pPr>
+              <w:spacing w:after="0"/>
+              <w:rPr>
+                <w:sz w:val="18"/>
+              </w:rPr>
+            </w:pPr>
+            <w:r>
+              <w:rPr>
+                <w:sz w:val="18"/>
+                <w:szCs w:val="18"/>
+              </w:rPr>
+              <w:t xml:space="preserve">Image</w:t>
+            </w:r>
+          </w:p>
+        </w:tc>
+        <w:tc>
+          <w:tcPr>
+            <w:tcW w:w="2500" w:type="dxa"/>
+            <w:tcMar>
+              <w:top w:w="60" w:type="dxa"/>
+              <w:left w:w="80" w:type="dxa"/>
+              <w:bottom w:w="60" w:type="dxa"/>
+              <w:right w:w="80" w:type="dxa"/>
+            </w:tcMar>
+            <w:vAlign w:val="center"/>
+          </w:tcPr>
+          <w:p>
+            <w:pPr>
+              <w:spacing w:after="0"/>
+              <w:rPr>
+                <w:sz w:val="18"/>
+              </w:rPr>
+            </w:pPr>
+            <w:r>
+              <w:rPr>
+                <w:sz w:val="18"/>
+                <w:szCs w:val="18"/>
+              </w:rPr>
+              <w:t xml:space="preserve">Deepfakes collected from the internet, with baseline detectors</w:t>
+            </w:r>
+          </w:p>
+        </w:tc>
+        <w:tc>
+          <w:tcPr>
+            <w:tcW w:w="2200" w:type="dxa"/>
+            <w:tcMar>
+              <w:top w:w="60" w:type="dxa"/>
+              <w:left w:w="80" w:type="dxa"/>
+              <w:bottom w:w="60" w:type="dxa"/>
+              <w:right w:w="80" w:type="dxa"/>
+            </w:tcMar>
+            <w:vAlign w:val="center"/>
+          </w:tcPr>
+          <w:p>
+            <w:pPr>
+              <w:spacing w:after="0"/>
+              <w:rPr>
+                <w:sz w:val="18"/>
+              </w:rPr>
+            </w:pPr>
+            <w:r>
+              <w:rPr>
+                <w:sz w:val="18"/>
+                <w:szCs w:val="18"/>
+              </w:rPr>
+              <w:t xml:space="preserve">A harder, uncontrolled test than lab-made data</w:t>
+            </w:r>
+          </w:p>
+        </w:tc>
+        <w:tc>
+          <w:tcPr>
+            <w:tcW w:w="2000" w:type="dxa"/>
+            <w:tcMar>
+              <w:top w:w="60" w:type="dxa"/>
+              <w:left w:w="80" w:type="dxa"/>
+              <w:bottom w:w="60" w:type="dxa"/>
+              <w:right w:w="80" w:type="dxa"/>
+            </w:tcMar>
+            <w:vAlign w:val="center"/>
+          </w:tcPr>
+          <w:p>
+            <w:pPr>
+              <w:spacing w:after="0"/>
+              <w:rPr>
+                <w:sz w:val="18"/>
+              </w:rPr>
+            </w:pPr>
+            <w:r>
+              <w:rPr>
+                <w:sz w:val="18"/>
+                <w:szCs w:val="18"/>
+              </w:rPr>
+              <w:t xml:space="preserve">Measures detection only; the verdict is not explained</w:t>
             </w:r>
           </w:p>
         </w:tc>
       </w:tr>
       <w:tr>
         <w:trPr>
+          <w:cantSplit/>
           <w:jc w:val="center"/>
         </w:trPr>
         <w:tc>
           <w:tcPr>
-            <w:tcW w:w="1656" w:type="dxa"/>
-          </w:tcPr>
-          <w:p>
-            <w:pPr>
-              <w:rPr>
-                <w:sz w:val="24"/>
-                <w:szCs w:val="24"/>
-              </w:rPr>
-            </w:pPr>
-            <w:r>
-              <w:rPr>
-                <w:sz w:val="24"/>
-                <w:szCs w:val="24"/>
-              </w:rPr>
-              <w:t>2020</w:t>
-            </w:r>
-          </w:p>
-        </w:tc>
-        <w:tc>
-          <w:tcPr>
-            <w:tcW w:w="1656" w:type="dxa"/>
-          </w:tcPr>
-          <w:p>
-            <w:pPr>
-              <w:rPr>
-                <w:sz w:val="24"/>
-                <w:szCs w:val="24"/>
-              </w:rPr>
-            </w:pPr>
-            <w:r>
-              <w:rPr>
-                <w:sz w:val="24"/>
-                <w:szCs w:val="24"/>
-              </w:rPr>
-              <w:t>Lewis et al. [6]</w:t>
-            </w:r>
-          </w:p>
-        </w:tc>
-        <w:tc>
-          <w:tcPr>
-            <w:tcW w:w="1656" w:type="dxa"/>
-          </w:tcPr>
-          <w:p>
-            <w:pPr>
-              <w:rPr>
-                <w:sz w:val="24"/>
-                <w:szCs w:val="24"/>
-              </w:rPr>
-            </w:pPr>
-            <w:r>
-              <w:rPr>
-                <w:sz w:val="24"/>
-                <w:szCs w:val="24"/>
-              </w:rPr>
-              <w:t>RAG</w:t>
-            </w:r>
-          </w:p>
-        </w:tc>
-        <w:tc>
-          <w:tcPr>
-            <w:tcW w:w="1656" w:type="dxa"/>
-          </w:tcPr>
-          <w:p>
-            <w:pPr>
-              <w:rPr>
-                <w:sz w:val="24"/>
-                <w:szCs w:val="24"/>
-              </w:rPr>
-            </w:pPr>
-            <w:r>
-              <w:rPr>
-                <w:sz w:val="24"/>
-                <w:szCs w:val="24"/>
-              </w:rPr>
-              <w:t>Retrieval-augmented generation with external non-parametric memory</w:t>
-            </w:r>
-          </w:p>
-        </w:tc>
-        <w:tc>
-          <w:tcPr>
-            <w:tcW w:w="1656" w:type="dxa"/>
-          </w:tcPr>
-          <w:p>
-            <w:pPr>
-              <w:rPr>
-                <w:sz w:val="24"/>
-                <w:szCs w:val="24"/>
-              </w:rPr>
-            </w:pPr>
-            <w:r>
-              <w:rPr>
-                <w:sz w:val="24"/>
-                <w:szCs w:val="24"/>
-              </w:rPr>
-              <w:t>Retrieval can provide explicit external knowledge and provenance</w:t>
-            </w:r>
-          </w:p>
-        </w:tc>
-        <w:tc>
-          <w:tcPr>
-            <w:tcW w:w="1656" w:type="dxa"/>
-          </w:tcPr>
-          <w:p>
-            <w:pPr>
-              <w:rPr>
-                <w:sz w:val="24"/>
-                <w:szCs w:val="24"/>
-              </w:rPr>
-            </w:pPr>
-            <w:r>
-              <w:rPr>
-                <w:sz w:val="24"/>
-                <w:szCs w:val="24"/>
-              </w:rPr>
-              <w:t>Retrieval quality directly affects generated output</w:t>
+            <w:tcW w:w="650" w:type="dxa"/>
+            <w:tcMar>
+              <w:top w:w="60" w:type="dxa"/>
+              <w:left w:w="80" w:type="dxa"/>
+              <w:bottom w:w="60" w:type="dxa"/>
+              <w:right w:w="80" w:type="dxa"/>
+            </w:tcMar>
+            <w:vAlign w:val="center"/>
+          </w:tcPr>
+          <w:p>
+            <w:pPr>
+              <w:spacing w:after="0"/>
+              <w:rPr>
+                <w:sz w:val="18"/>
+              </w:rPr>
+            </w:pPr>
+            <w:r>
+              <w:rPr>
+                <w:sz w:val="18"/>
+                <w:szCs w:val="18"/>
+              </w:rPr>
+              <w:t xml:space="preserve">2020</w:t>
+            </w:r>
+          </w:p>
+        </w:tc>
+        <w:tc>
+          <w:tcPr>
+            <w:tcW w:w="1500" w:type="dxa"/>
+            <w:tcMar>
+              <w:top w:w="60" w:type="dxa"/>
+              <w:left w:w="80" w:type="dxa"/>
+              <w:bottom w:w="60" w:type="dxa"/>
+              <w:right w:w="80" w:type="dxa"/>
+            </w:tcMar>
+            <w:vAlign w:val="center"/>
+          </w:tcPr>
+          <w:p>
+            <w:pPr>
+              <w:spacing w:after="0"/>
+              <w:rPr>
+                <w:sz w:val="18"/>
+              </w:rPr>
+            </w:pPr>
+            <w:r>
+              <w:rPr>
+                <w:sz w:val="18"/>
+                <w:szCs w:val="18"/>
+              </w:rPr>
+              <w:t xml:space="preserve">Lewis et al. [6]</w:t>
+            </w:r>
+          </w:p>
+        </w:tc>
+        <w:tc>
+          <w:tcPr>
+            <w:tcW w:w="1050" w:type="dxa"/>
+            <w:tcMar>
+              <w:top w:w="60" w:type="dxa"/>
+              <w:left w:w="80" w:type="dxa"/>
+              <w:bottom w:w="60" w:type="dxa"/>
+              <w:right w:w="80" w:type="dxa"/>
+            </w:tcMar>
+            <w:vAlign w:val="center"/>
+          </w:tcPr>
+          <w:p>
+            <w:pPr>
+              <w:spacing w:after="0"/>
+              <w:rPr>
+                <w:sz w:val="18"/>
+              </w:rPr>
+            </w:pPr>
+            <w:r>
+              <w:rPr>
+                <w:sz w:val="18"/>
+                <w:szCs w:val="18"/>
+              </w:rPr>
+              <w:t xml:space="preserve">RAG</w:t>
+            </w:r>
+          </w:p>
+        </w:tc>
+        <w:tc>
+          <w:tcPr>
+            <w:tcW w:w="2500" w:type="dxa"/>
+            <w:tcMar>
+              <w:top w:w="60" w:type="dxa"/>
+              <w:left w:w="80" w:type="dxa"/>
+              <w:bottom w:w="60" w:type="dxa"/>
+              <w:right w:w="80" w:type="dxa"/>
+            </w:tcMar>
+            <w:vAlign w:val="center"/>
+          </w:tcPr>
+          <w:p>
+            <w:pPr>
+              <w:spacing w:after="0"/>
+              <w:rPr>
+                <w:sz w:val="18"/>
+              </w:rPr>
+            </w:pPr>
+            <w:r>
+              <w:rPr>
+                <w:sz w:val="18"/>
+                <w:szCs w:val="18"/>
+              </w:rPr>
+              <w:t xml:space="preserve">Generation conditioned on passages retrieved from an external index</w:t>
+            </w:r>
+          </w:p>
+        </w:tc>
+        <w:tc>
+          <w:tcPr>
+            <w:tcW w:w="2200" w:type="dxa"/>
+            <w:tcMar>
+              <w:top w:w="60" w:type="dxa"/>
+              <w:left w:w="80" w:type="dxa"/>
+              <w:bottom w:w="60" w:type="dxa"/>
+              <w:right w:w="80" w:type="dxa"/>
+            </w:tcMar>
+            <w:vAlign w:val="center"/>
+          </w:tcPr>
+          <w:p>
+            <w:pPr>
+              <w:spacing w:after="0"/>
+              <w:rPr>
+                <w:sz w:val="18"/>
+              </w:rPr>
+            </w:pPr>
+            <w:r>
+              <w:rPr>
+                <w:sz w:val="18"/>
+                <w:szCs w:val="18"/>
+              </w:rPr>
+              <w:t xml:space="preserve">Sources can be named and updated without retraining</w:t>
+            </w:r>
+          </w:p>
+        </w:tc>
+        <w:tc>
+          <w:tcPr>
+            <w:tcW w:w="2000" w:type="dxa"/>
+            <w:tcMar>
+              <w:top w:w="60" w:type="dxa"/>
+              <w:left w:w="80" w:type="dxa"/>
+              <w:bottom w:w="60" w:type="dxa"/>
+              <w:right w:w="80" w:type="dxa"/>
+            </w:tcMar>
+            <w:vAlign w:val="center"/>
+          </w:tcPr>
+          <w:p>
+            <w:pPr>
+              <w:spacing w:after="0"/>
+              <w:rPr>
+                <w:sz w:val="18"/>
+              </w:rPr>
+            </w:pPr>
+            <w:r>
+              <w:rPr>
+                <w:sz w:val="18"/>
+                <w:szCs w:val="18"/>
+              </w:rPr>
+              <w:t xml:space="preserve">Output is only as good as the passages retrieved</w:t>
             </w:r>
           </w:p>
         </w:tc>
       </w:tr>
       <w:tr>
         <w:trPr>
+          <w:cantSplit/>
           <w:jc w:val="center"/>
         </w:trPr>
         <w:tc>
           <w:tcPr>
-            <w:tcW w:w="1656" w:type="dxa"/>
-          </w:tcPr>
-          <w:p>
-            <w:pPr>
-              <w:rPr>
-                <w:sz w:val="24"/>
-                <w:szCs w:val="24"/>
-              </w:rPr>
-            </w:pPr>
-            <w:r>
-              <w:rPr>
-                <w:sz w:val="24"/>
-                <w:szCs w:val="24"/>
-              </w:rPr>
-              <w:t>2023</w:t>
-            </w:r>
-          </w:p>
-        </w:tc>
-        <w:tc>
-          <w:tcPr>
-            <w:tcW w:w="1656" w:type="dxa"/>
-          </w:tcPr>
-          <w:p>
-            <w:pPr>
-              <w:rPr>
-                <w:sz w:val="24"/>
-                <w:szCs w:val="24"/>
-              </w:rPr>
-            </w:pPr>
-            <w:r>
-              <w:rPr>
-                <w:sz w:val="24"/>
-                <w:szCs w:val="24"/>
-              </w:rPr>
-              <w:t>Mitchell et al. [2]</w:t>
-            </w:r>
-          </w:p>
-        </w:tc>
-        <w:tc>
-          <w:tcPr>
-            <w:tcW w:w="1656" w:type="dxa"/>
-          </w:tcPr>
-          <w:p>
-            <w:pPr>
-              <w:rPr>
-                <w:sz w:val="24"/>
-                <w:szCs w:val="24"/>
-              </w:rPr>
-            </w:pPr>
-            <w:r>
-              <w:rPr>
-                <w:sz w:val="24"/>
-                <w:szCs w:val="24"/>
-              </w:rPr>
-              <w:t>Text</w:t>
-            </w:r>
-          </w:p>
-        </w:tc>
-        <w:tc>
-          <w:tcPr>
-            <w:tcW w:w="1656" w:type="dxa"/>
-          </w:tcPr>
-          <w:p>
-            <w:pPr>
-              <w:rPr>
-                <w:sz w:val="24"/>
-                <w:szCs w:val="24"/>
-              </w:rPr>
-            </w:pPr>
-            <w:r>
-              <w:rPr>
-                <w:sz w:val="24"/>
-                <w:szCs w:val="24"/>
-              </w:rPr>
-              <w:t>DetectGPT zero-shot probability-curvature criterion</w:t>
-            </w:r>
-          </w:p>
-        </w:tc>
-        <w:tc>
-          <w:tcPr>
-            <w:tcW w:w="1656" w:type="dxa"/>
-          </w:tcPr>
-          <w:p>
-            <w:pPr>
-              <w:rPr>
-                <w:sz w:val="24"/>
-                <w:szCs w:val="24"/>
-              </w:rPr>
-            </w:pPr>
-            <w:r>
-              <w:rPr>
-                <w:sz w:val="24"/>
-                <w:szCs w:val="24"/>
-              </w:rPr>
-              <w:t>No separate classifier training required</w:t>
-            </w:r>
-          </w:p>
-        </w:tc>
-        <w:tc>
-          <w:tcPr>
-            <w:tcW w:w="1656" w:type="dxa"/>
-          </w:tcPr>
-          <w:p>
-            <w:pPr>
-              <w:rPr>
-                <w:sz w:val="24"/>
-                <w:szCs w:val="24"/>
-              </w:rPr>
-            </w:pPr>
-            <w:r>
-              <w:rPr>
-                <w:sz w:val="24"/>
-                <w:szCs w:val="24"/>
-              </w:rPr>
-              <w:t>Computationally heavier and tied to model probability behavior</w:t>
+            <w:tcW w:w="650" w:type="dxa"/>
+            <w:tcMar>
+              <w:top w:w="60" w:type="dxa"/>
+              <w:left w:w="80" w:type="dxa"/>
+              <w:bottom w:w="60" w:type="dxa"/>
+              <w:right w:w="80" w:type="dxa"/>
+            </w:tcMar>
+            <w:vAlign w:val="center"/>
+          </w:tcPr>
+          <w:p>
+            <w:pPr>
+              <w:spacing w:after="0"/>
+              <w:rPr>
+                <w:sz w:val="18"/>
+              </w:rPr>
+            </w:pPr>
+            <w:r>
+              <w:rPr>
+                <w:sz w:val="18"/>
+                <w:szCs w:val="18"/>
+              </w:rPr>
+              <w:t xml:space="preserve">2023</w:t>
+            </w:r>
+          </w:p>
+        </w:tc>
+        <w:tc>
+          <w:tcPr>
+            <w:tcW w:w="1500" w:type="dxa"/>
+            <w:tcMar>
+              <w:top w:w="60" w:type="dxa"/>
+              <w:left w:w="80" w:type="dxa"/>
+              <w:bottom w:w="60" w:type="dxa"/>
+              <w:right w:w="80" w:type="dxa"/>
+            </w:tcMar>
+            <w:vAlign w:val="center"/>
+          </w:tcPr>
+          <w:p>
+            <w:pPr>
+              <w:spacing w:after="0"/>
+              <w:rPr>
+                <w:sz w:val="18"/>
+              </w:rPr>
+            </w:pPr>
+            <w:r>
+              <w:rPr>
+                <w:sz w:val="18"/>
+                <w:szCs w:val="18"/>
+              </w:rPr>
+              <w:t xml:space="preserve">Mitchell et al. [2]</w:t>
+            </w:r>
+          </w:p>
+        </w:tc>
+        <w:tc>
+          <w:tcPr>
+            <w:tcW w:w="1050" w:type="dxa"/>
+            <w:tcMar>
+              <w:top w:w="60" w:type="dxa"/>
+              <w:left w:w="80" w:type="dxa"/>
+              <w:bottom w:w="60" w:type="dxa"/>
+              <w:right w:w="80" w:type="dxa"/>
+            </w:tcMar>
+            <w:vAlign w:val="center"/>
+          </w:tcPr>
+          <w:p>
+            <w:pPr>
+              <w:spacing w:after="0"/>
+              <w:rPr>
+                <w:sz w:val="18"/>
+              </w:rPr>
+            </w:pPr>
+            <w:r>
+              <w:rPr>
+                <w:sz w:val="18"/>
+                <w:szCs w:val="18"/>
+              </w:rPr>
+              <w:t xml:space="preserve">Text</w:t>
+            </w:r>
+          </w:p>
+        </w:tc>
+        <w:tc>
+          <w:tcPr>
+            <w:tcW w:w="2500" w:type="dxa"/>
+            <w:tcMar>
+              <w:top w:w="60" w:type="dxa"/>
+              <w:left w:w="80" w:type="dxa"/>
+              <w:bottom w:w="60" w:type="dxa"/>
+              <w:right w:w="80" w:type="dxa"/>
+            </w:tcMar>
+            <w:vAlign w:val="center"/>
+          </w:tcPr>
+          <w:p>
+            <w:pPr>
+              <w:spacing w:after="0"/>
+              <w:rPr>
+                <w:sz w:val="18"/>
+              </w:rPr>
+            </w:pPr>
+            <w:r>
+              <w:rPr>
+                <w:sz w:val="18"/>
+                <w:szCs w:val="18"/>
+              </w:rPr>
+              <w:t xml:space="preserve">DetectGPT: machine text sits near a local maximum of model likelihood</w:t>
+            </w:r>
+          </w:p>
+        </w:tc>
+        <w:tc>
+          <w:tcPr>
+            <w:tcW w:w="2200" w:type="dxa"/>
+            <w:tcMar>
+              <w:top w:w="60" w:type="dxa"/>
+              <w:left w:w="80" w:type="dxa"/>
+              <w:bottom w:w="60" w:type="dxa"/>
+              <w:right w:w="80" w:type="dxa"/>
+            </w:tcMar>
+            <w:vAlign w:val="center"/>
+          </w:tcPr>
+          <w:p>
+            <w:pPr>
+              <w:spacing w:after="0"/>
+              <w:rPr>
+                <w:sz w:val="18"/>
+              </w:rPr>
+            </w:pPr>
+            <w:r>
+              <w:rPr>
+                <w:sz w:val="18"/>
+                <w:szCs w:val="18"/>
+              </w:rPr>
+              <w:t xml:space="preserve">Works without training a detector</w:t>
+            </w:r>
+          </w:p>
+        </w:tc>
+        <w:tc>
+          <w:tcPr>
+            <w:tcW w:w="2000" w:type="dxa"/>
+            <w:tcMar>
+              <w:top w:w="60" w:type="dxa"/>
+              <w:left w:w="80" w:type="dxa"/>
+              <w:bottom w:w="60" w:type="dxa"/>
+              <w:right w:w="80" w:type="dxa"/>
+            </w:tcMar>
+            <w:vAlign w:val="center"/>
+          </w:tcPr>
+          <w:p>
+            <w:pPr>
+              <w:spacing w:after="0"/>
+              <w:rPr>
+                <w:sz w:val="18"/>
+              </w:rPr>
+            </w:pPr>
+            <w:r>
+              <w:rPr>
+                <w:sz w:val="18"/>
+                <w:szCs w:val="18"/>
+              </w:rPr>
+              <w:t xml:space="preserve">Needs many model evaluations per text; tied to specific model behaviour</w:t>
             </w:r>
           </w:p>
         </w:tc>
       </w:tr>
       <w:tr>
         <w:trPr>
+          <w:cantSplit/>
           <w:jc w:val="center"/>
         </w:trPr>
         <w:tc>
           <w:tcPr>
-            <w:tcW w:w="1656" w:type="dxa"/>
-          </w:tcPr>
-          <w:p>
-            <w:pPr>
-              <w:rPr>
-                <w:sz w:val="24"/>
-                <w:szCs w:val="24"/>
-              </w:rPr>
-            </w:pPr>
-            <w:r>
-              <w:rPr>
-                <w:sz w:val="24"/>
-                <w:szCs w:val="24"/>
-              </w:rPr>
-              <w:t>2024</w:t>
-            </w:r>
-          </w:p>
-        </w:tc>
-        <w:tc>
-          <w:tcPr>
-            <w:tcW w:w="1656" w:type="dxa"/>
-          </w:tcPr>
-          <w:p>
-            <w:pPr>
-              <w:rPr>
-                <w:sz w:val="24"/>
-                <w:szCs w:val="24"/>
-              </w:rPr>
-            </w:pPr>
-            <w:r>
-              <w:rPr>
-                <w:sz w:val="24"/>
-                <w:szCs w:val="24"/>
-              </w:rPr>
-              <w:t>Hans et al. [3]</w:t>
-            </w:r>
-          </w:p>
-        </w:tc>
-        <w:tc>
-          <w:tcPr>
-            <w:tcW w:w="1656" w:type="dxa"/>
-          </w:tcPr>
-          <w:p>
-            <w:pPr>
-              <w:rPr>
-                <w:sz w:val="24"/>
-                <w:szCs w:val="24"/>
-              </w:rPr>
-            </w:pPr>
-            <w:r>
-              <w:rPr>
-                <w:sz w:val="24"/>
-                <w:szCs w:val="24"/>
-              </w:rPr>
-              <w:t>Text</w:t>
-            </w:r>
-          </w:p>
-        </w:tc>
-        <w:tc>
-          <w:tcPr>
-            <w:tcW w:w="1656" w:type="dxa"/>
-          </w:tcPr>
-          <w:p>
-            <w:pPr>
-              <w:rPr>
-                <w:sz w:val="24"/>
-                <w:szCs w:val="24"/>
-              </w:rPr>
-            </w:pPr>
-            <w:r>
-              <w:rPr>
-                <w:sz w:val="24"/>
-                <w:szCs w:val="24"/>
-              </w:rPr>
-              <w:t>Binoculars zero-shot detector using two language models</w:t>
-            </w:r>
-          </w:p>
-        </w:tc>
-        <w:tc>
-          <w:tcPr>
-            <w:tcW w:w="1656" w:type="dxa"/>
-          </w:tcPr>
-          <w:p>
-            <w:pPr>
-              <w:rPr>
-                <w:sz w:val="24"/>
-                <w:szCs w:val="24"/>
-              </w:rPr>
-            </w:pPr>
-            <w:r>
-              <w:rPr>
-                <w:sz w:val="24"/>
-                <w:szCs w:val="24"/>
-              </w:rPr>
-              <w:t>Strong zero-shot detection across document types</w:t>
-            </w:r>
-          </w:p>
-        </w:tc>
-        <w:tc>
-          <w:tcPr>
-            <w:tcW w:w="1656" w:type="dxa"/>
-          </w:tcPr>
-          <w:p>
-            <w:pPr>
-              <w:rPr>
-                <w:sz w:val="24"/>
-                <w:szCs w:val="24"/>
-              </w:rPr>
-            </w:pPr>
-            <w:r>
-              <w:rPr>
-                <w:sz w:val="24"/>
-                <w:szCs w:val="24"/>
-              </w:rPr>
-              <w:t>Robustness can vary with generator/domain and requires model inference</w:t>
+            <w:tcW w:w="650" w:type="dxa"/>
+            <w:tcMar>
+              <w:top w:w="60" w:type="dxa"/>
+              <w:left w:w="80" w:type="dxa"/>
+              <w:bottom w:w="60" w:type="dxa"/>
+              <w:right w:w="80" w:type="dxa"/>
+            </w:tcMar>
+            <w:vAlign w:val="center"/>
+          </w:tcPr>
+          <w:p>
+            <w:pPr>
+              <w:spacing w:after="0"/>
+              <w:rPr>
+                <w:sz w:val="18"/>
+              </w:rPr>
+            </w:pPr>
+            <w:r>
+              <w:rPr>
+                <w:sz w:val="18"/>
+                <w:szCs w:val="18"/>
+              </w:rPr>
+              <w:t xml:space="preserve">2024</w:t>
+            </w:r>
+          </w:p>
+        </w:tc>
+        <w:tc>
+          <w:tcPr>
+            <w:tcW w:w="1500" w:type="dxa"/>
+            <w:tcMar>
+              <w:top w:w="60" w:type="dxa"/>
+              <w:left w:w="80" w:type="dxa"/>
+              <w:bottom w:w="60" w:type="dxa"/>
+              <w:right w:w="80" w:type="dxa"/>
+            </w:tcMar>
+            <w:vAlign w:val="center"/>
+          </w:tcPr>
+          <w:p>
+            <w:pPr>
+              <w:spacing w:after="0"/>
+              <w:rPr>
+                <w:sz w:val="18"/>
+              </w:rPr>
+            </w:pPr>
+            <w:r>
+              <w:rPr>
+                <w:sz w:val="18"/>
+                <w:szCs w:val="18"/>
+              </w:rPr>
+              <w:t xml:space="preserve">Hans et al. [3]</w:t>
+            </w:r>
+          </w:p>
+        </w:tc>
+        <w:tc>
+          <w:tcPr>
+            <w:tcW w:w="1050" w:type="dxa"/>
+            <w:tcMar>
+              <w:top w:w="60" w:type="dxa"/>
+              <w:left w:w="80" w:type="dxa"/>
+              <w:bottom w:w="60" w:type="dxa"/>
+              <w:right w:w="80" w:type="dxa"/>
+            </w:tcMar>
+            <w:vAlign w:val="center"/>
+          </w:tcPr>
+          <w:p>
+            <w:pPr>
+              <w:spacing w:after="0"/>
+              <w:rPr>
+                <w:sz w:val="18"/>
+              </w:rPr>
+            </w:pPr>
+            <w:r>
+              <w:rPr>
+                <w:sz w:val="18"/>
+                <w:szCs w:val="18"/>
+              </w:rPr>
+              <w:t xml:space="preserve">Text</w:t>
+            </w:r>
+          </w:p>
+        </w:tc>
+        <w:tc>
+          <w:tcPr>
+            <w:tcW w:w="2500" w:type="dxa"/>
+            <w:tcMar>
+              <w:top w:w="60" w:type="dxa"/>
+              <w:left w:w="80" w:type="dxa"/>
+              <w:bottom w:w="60" w:type="dxa"/>
+              <w:right w:w="80" w:type="dxa"/>
+            </w:tcMar>
+            <w:vAlign w:val="center"/>
+          </w:tcPr>
+          <w:p>
+            <w:pPr>
+              <w:spacing w:after="0"/>
+              <w:rPr>
+                <w:sz w:val="18"/>
+              </w:rPr>
+            </w:pPr>
+            <w:r>
+              <w:rPr>
+                <w:sz w:val="18"/>
+                <w:szCs w:val="18"/>
+              </w:rPr>
+              <w:t xml:space="preserve">Binoculars: ratio of perplexity to cross-perplexity from two models</w:t>
+            </w:r>
+          </w:p>
+        </w:tc>
+        <w:tc>
+          <w:tcPr>
+            <w:tcW w:w="2200" w:type="dxa"/>
+            <w:tcMar>
+              <w:top w:w="60" w:type="dxa"/>
+              <w:left w:w="80" w:type="dxa"/>
+              <w:bottom w:w="60" w:type="dxa"/>
+              <w:right w:w="80" w:type="dxa"/>
+            </w:tcMar>
+            <w:vAlign w:val="center"/>
+          </w:tcPr>
+          <w:p>
+            <w:pPr>
+              <w:spacing w:after="0"/>
+              <w:rPr>
+                <w:sz w:val="18"/>
+              </w:rPr>
+            </w:pPr>
+            <w:r>
+              <w:rPr>
+                <w:sz w:val="18"/>
+                <w:szCs w:val="18"/>
+              </w:rPr>
+              <w:t xml:space="preserve">Competitive zero-shot detection across document types</w:t>
+            </w:r>
+          </w:p>
+        </w:tc>
+        <w:tc>
+          <w:tcPr>
+            <w:tcW w:w="2000" w:type="dxa"/>
+            <w:tcMar>
+              <w:top w:w="60" w:type="dxa"/>
+              <w:left w:w="80" w:type="dxa"/>
+              <w:bottom w:w="60" w:type="dxa"/>
+              <w:right w:w="80" w:type="dxa"/>
+            </w:tcMar>
+            <w:vAlign w:val="center"/>
+          </w:tcPr>
+          <w:p>
+            <w:pPr>
+              <w:spacing w:after="0"/>
+              <w:rPr>
+                <w:sz w:val="18"/>
+              </w:rPr>
+            </w:pPr>
+            <w:r>
+              <w:rPr>
+                <w:sz w:val="18"/>
+                <w:szCs w:val="18"/>
+              </w:rPr>
+              <w:t xml:space="preserve">Accuracy varies by generator and domain; two models must be loaded</w:t>
             </w:r>
           </w:p>
         </w:tc>
       </w:tr>
       <w:tr>
         <w:trPr>
+          <w:cantSplit/>
           <w:jc w:val="center"/>
         </w:trPr>
         <w:tc>
           <w:tcPr>
-            <w:tcW w:w="1656" w:type="dxa"/>
-          </w:tcPr>
-          <w:p>
-            <w:pPr>
-              <w:rPr>
-                <w:sz w:val="24"/>
-                <w:szCs w:val="24"/>
-              </w:rPr>
-            </w:pPr>
-            <w:r>
-              <w:rPr>
-                <w:sz w:val="24"/>
-                <w:szCs w:val="24"/>
-              </w:rPr>
-              <w:t>2024</w:t>
-            </w:r>
-          </w:p>
-        </w:tc>
-        <w:tc>
-          <w:tcPr>
-            <w:tcW w:w="1656" w:type="dxa"/>
-          </w:tcPr>
-          <w:p>
-            <w:pPr>
-              <w:rPr>
-                <w:sz w:val="24"/>
-                <w:szCs w:val="24"/>
-              </w:rPr>
-            </w:pPr>
-            <w:r>
-              <w:rPr>
-                <w:sz w:val="24"/>
-                <w:szCs w:val="24"/>
-              </w:rPr>
-              <w:t>Dugan et al. [1]</w:t>
-            </w:r>
-          </w:p>
-        </w:tc>
-        <w:tc>
-          <w:tcPr>
-            <w:tcW w:w="1656" w:type="dxa"/>
-          </w:tcPr>
-          <w:p>
-            <w:pPr>
-              <w:rPr>
-                <w:sz w:val="24"/>
-                <w:szCs w:val="24"/>
-              </w:rPr>
-            </w:pPr>
-            <w:r>
-              <w:rPr>
-                <w:sz w:val="24"/>
-                <w:szCs w:val="24"/>
-              </w:rPr>
-              <w:t>Text</w:t>
-            </w:r>
-          </w:p>
-        </w:tc>
-        <w:tc>
-          <w:tcPr>
-            <w:tcW w:w="1656" w:type="dxa"/>
-          </w:tcPr>
-          <w:p>
-            <w:pPr>
-              <w:rPr>
-                <w:sz w:val="24"/>
-                <w:szCs w:val="24"/>
-              </w:rPr>
-            </w:pPr>
-            <w:r>
-              <w:rPr>
-                <w:sz w:val="24"/>
-                <w:szCs w:val="24"/>
-              </w:rPr>
-              <w:t>RAID robustness benchmark</w:t>
-            </w:r>
-          </w:p>
-        </w:tc>
-        <w:tc>
-          <w:tcPr>
-            <w:tcW w:w="1656" w:type="dxa"/>
-          </w:tcPr>
-          <w:p>
-            <w:pPr>
-              <w:rPr>
-                <w:sz w:val="24"/>
-                <w:szCs w:val="24"/>
-              </w:rPr>
-            </w:pPr>
-            <w:r>
-              <w:rPr>
-                <w:sz w:val="24"/>
-                <w:szCs w:val="24"/>
-              </w:rPr>
-              <w:t xml:space="preserve">Exposes failures under attacks, decoding </w:t>
-            </w:r>
-            <w:r>
-              <w:rPr>
-                <w:sz w:val="24"/>
-                <w:szCs w:val="24"/>
-              </w:rPr>
-              <w:lastRenderedPageBreak/>
-              <w:t>changes and unseen models</w:t>
-            </w:r>
-          </w:p>
-        </w:tc>
-        <w:tc>
-          <w:tcPr>
-            <w:tcW w:w="1656" w:type="dxa"/>
-          </w:tcPr>
-          <w:p>
-            <w:pPr>
-              <w:rPr>
-                <w:sz w:val="24"/>
-                <w:szCs w:val="24"/>
-              </w:rPr>
-            </w:pPr>
-            <w:r>
-              <w:rPr>
-                <w:sz w:val="24"/>
-                <w:szCs w:val="24"/>
-              </w:rPr>
-              <w:lastRenderedPageBreak/>
-              <w:t>Demonstrates that headline in-domain accuracy is insufficient</w:t>
+            <w:tcW w:w="650" w:type="dxa"/>
+            <w:tcMar>
+              <w:top w:w="60" w:type="dxa"/>
+              <w:left w:w="80" w:type="dxa"/>
+              <w:bottom w:w="60" w:type="dxa"/>
+              <w:right w:w="80" w:type="dxa"/>
+            </w:tcMar>
+            <w:vAlign w:val="center"/>
+          </w:tcPr>
+          <w:p>
+            <w:pPr>
+              <w:spacing w:after="0"/>
+              <w:rPr>
+                <w:sz w:val="18"/>
+              </w:rPr>
+            </w:pPr>
+            <w:r>
+              <w:rPr>
+                <w:sz w:val="18"/>
+                <w:szCs w:val="18"/>
+              </w:rPr>
+              <w:t xml:space="preserve">2024</w:t>
+            </w:r>
+          </w:p>
+        </w:tc>
+        <w:tc>
+          <w:tcPr>
+            <w:tcW w:w="1500" w:type="dxa"/>
+            <w:tcMar>
+              <w:top w:w="60" w:type="dxa"/>
+              <w:left w:w="80" w:type="dxa"/>
+              <w:bottom w:w="60" w:type="dxa"/>
+              <w:right w:w="80" w:type="dxa"/>
+            </w:tcMar>
+            <w:vAlign w:val="center"/>
+          </w:tcPr>
+          <w:p>
+            <w:pPr>
+              <w:spacing w:after="0"/>
+              <w:rPr>
+                <w:sz w:val="18"/>
+              </w:rPr>
+            </w:pPr>
+            <w:r>
+              <w:rPr>
+                <w:sz w:val="18"/>
+                <w:szCs w:val="18"/>
+              </w:rPr>
+              <w:t xml:space="preserve">Dugan et al. [1]</w:t>
+            </w:r>
+          </w:p>
+        </w:tc>
+        <w:tc>
+          <w:tcPr>
+            <w:tcW w:w="1050" w:type="dxa"/>
+            <w:tcMar>
+              <w:top w:w="60" w:type="dxa"/>
+              <w:left w:w="80" w:type="dxa"/>
+              <w:bottom w:w="60" w:type="dxa"/>
+              <w:right w:w="80" w:type="dxa"/>
+            </w:tcMar>
+            <w:vAlign w:val="center"/>
+          </w:tcPr>
+          <w:p>
+            <w:pPr>
+              <w:spacing w:after="0"/>
+              <w:rPr>
+                <w:sz w:val="18"/>
+              </w:rPr>
+            </w:pPr>
+            <w:r>
+              <w:rPr>
+                <w:sz w:val="18"/>
+                <w:szCs w:val="18"/>
+              </w:rPr>
+              <w:t xml:space="preserve">Text</w:t>
+            </w:r>
+          </w:p>
+        </w:tc>
+        <w:tc>
+          <w:tcPr>
+            <w:tcW w:w="2500" w:type="dxa"/>
+            <w:tcMar>
+              <w:top w:w="60" w:type="dxa"/>
+              <w:left w:w="80" w:type="dxa"/>
+              <w:bottom w:w="60" w:type="dxa"/>
+              <w:right w:w="80" w:type="dxa"/>
+            </w:tcMar>
+            <w:vAlign w:val="center"/>
+          </w:tcPr>
+          <w:p>
+            <w:pPr>
+              <w:spacing w:after="0"/>
+              <w:rPr>
+                <w:sz w:val="18"/>
+              </w:rPr>
+            </w:pPr>
+            <w:r>
+              <w:rPr>
+                <w:sz w:val="18"/>
+                <w:szCs w:val="18"/>
+              </w:rPr>
+              <w:t xml:space="preserve">RAID: very large test set varying model, domain, attack and decoding</w:t>
+            </w:r>
+          </w:p>
+        </w:tc>
+        <w:tc>
+          <w:tcPr>
+            <w:tcW w:w="2200" w:type="dxa"/>
+            <w:tcMar>
+              <w:top w:w="60" w:type="dxa"/>
+              <w:left w:w="80" w:type="dxa"/>
+              <w:bottom w:w="60" w:type="dxa"/>
+              <w:right w:w="80" w:type="dxa"/>
+            </w:tcMar>
+            <w:vAlign w:val="center"/>
+          </w:tcPr>
+          <w:p>
+            <w:pPr>
+              <w:spacing w:after="0"/>
+              <w:rPr>
+                <w:sz w:val="18"/>
+              </w:rPr>
+            </w:pPr>
+            <w:r>
+              <w:rPr>
+                <w:sz w:val="18"/>
+                <w:szCs w:val="18"/>
+              </w:rPr>
+              <w:t xml:space="preserve">Shows how quickly detectors fail off their training distribution</w:t>
+            </w:r>
+          </w:p>
+        </w:tc>
+        <w:tc>
+          <w:tcPr>
+            <w:tcW w:w="2000" w:type="dxa"/>
+            <w:tcMar>
+              <w:top w:w="60" w:type="dxa"/>
+              <w:left w:w="80" w:type="dxa"/>
+              <w:bottom w:w="60" w:type="dxa"/>
+              <w:right w:w="80" w:type="dxa"/>
+            </w:tcMar>
+            <w:vAlign w:val="center"/>
+          </w:tcPr>
+          <w:p>
+            <w:pPr>
+              <w:spacing w:after="0"/>
+              <w:rPr>
+                <w:sz w:val="18"/>
+              </w:rPr>
+            </w:pPr>
+            <w:r>
+              <w:rPr>
+                <w:sz w:val="18"/>
+                <w:szCs w:val="18"/>
+              </w:rPr>
+              <w:t xml:space="preserve">Reports the failures but proposes no remedy</w:t>
             </w:r>
           </w:p>
         </w:tc>
       </w:tr>
       <w:tr>
         <w:trPr>
+          <w:cantSplit/>
           <w:jc w:val="center"/>
         </w:trPr>
         <w:tc>
           <w:tcPr>
-            <w:tcW w:w="1656" w:type="dxa"/>
-          </w:tcPr>
-          <w:p>
-            <w:pPr>
-              <w:rPr>
-                <w:sz w:val="24"/>
-                <w:szCs w:val="24"/>
-              </w:rPr>
-            </w:pPr>
-            <w:r>
-              <w:rPr>
-                <w:sz w:val="24"/>
-                <w:szCs w:val="24"/>
-              </w:rPr>
-              <w:t>2026</w:t>
-            </w:r>
-          </w:p>
-        </w:tc>
-        <w:tc>
-          <w:tcPr>
-            <w:tcW w:w="1656" w:type="dxa"/>
-          </w:tcPr>
-          <w:p>
-            <w:pPr>
-              <w:rPr>
-                <w:sz w:val="24"/>
-                <w:szCs w:val="24"/>
-              </w:rPr>
-            </w:pPr>
-            <w:r>
-              <w:rPr>
-                <w:sz w:val="24"/>
-                <w:szCs w:val="24"/>
-              </w:rPr>
-              <w:t>Zhang et al. [7]</w:t>
-            </w:r>
-          </w:p>
-        </w:tc>
-        <w:tc>
-          <w:tcPr>
-            <w:tcW w:w="1656" w:type="dxa"/>
-          </w:tcPr>
-          <w:p>
-            <w:pPr>
-              <w:rPr>
-                <w:sz w:val="24"/>
-                <w:szCs w:val="24"/>
-              </w:rPr>
-            </w:pPr>
-            <w:r>
-              <w:rPr>
-                <w:sz w:val="24"/>
-                <w:szCs w:val="24"/>
-              </w:rPr>
-              <w:t>Agentic image forensics</w:t>
-            </w:r>
-          </w:p>
-        </w:tc>
-        <w:tc>
-          <w:tcPr>
-            <w:tcW w:w="1656" w:type="dxa"/>
-          </w:tcPr>
-          <w:p>
-            <w:pPr>
-              <w:rPr>
-                <w:sz w:val="24"/>
-                <w:szCs w:val="24"/>
-              </w:rPr>
-            </w:pPr>
-            <w:r>
-              <w:rPr>
-                <w:sz w:val="24"/>
-                <w:szCs w:val="24"/>
-              </w:rPr>
-              <w:t>ForenAgent: iterative MLLM tool use for forgery analysis</w:t>
-            </w:r>
-          </w:p>
-        </w:tc>
-        <w:tc>
-          <w:tcPr>
-            <w:tcW w:w="1656" w:type="dxa"/>
-          </w:tcPr>
-          <w:p>
-            <w:pPr>
-              <w:rPr>
-                <w:sz w:val="24"/>
-                <w:szCs w:val="24"/>
-              </w:rPr>
-            </w:pPr>
-            <w:r>
-              <w:rPr>
-                <w:sz w:val="24"/>
-                <w:szCs w:val="24"/>
-              </w:rPr>
-              <w:t>Supports adaptive probing and low-level tool use</w:t>
-            </w:r>
-          </w:p>
-        </w:tc>
-        <w:tc>
-          <w:tcPr>
-            <w:tcW w:w="1656" w:type="dxa"/>
-          </w:tcPr>
-          <w:p>
-            <w:pPr>
-              <w:rPr>
-                <w:sz w:val="24"/>
-                <w:szCs w:val="24"/>
-              </w:rPr>
-            </w:pPr>
-            <w:r>
-              <w:rPr>
-                <w:sz w:val="24"/>
-                <w:szCs w:val="24"/>
-              </w:rPr>
-              <w:t>Agentic evaluation, latency and reliability remain non-trivial</w:t>
+            <w:tcW w:w="650" w:type="dxa"/>
+            <w:tcMar>
+              <w:top w:w="60" w:type="dxa"/>
+              <w:left w:w="80" w:type="dxa"/>
+              <w:bottom w:w="60" w:type="dxa"/>
+              <w:right w:w="80" w:type="dxa"/>
+            </w:tcMar>
+            <w:vAlign w:val="center"/>
+          </w:tcPr>
+          <w:p>
+            <w:pPr>
+              <w:spacing w:after="0"/>
+              <w:rPr>
+                <w:sz w:val="18"/>
+              </w:rPr>
+            </w:pPr>
+            <w:r>
+              <w:rPr>
+                <w:sz w:val="18"/>
+                <w:szCs w:val="18"/>
+              </w:rPr>
+              <w:t xml:space="preserve">2026</w:t>
+            </w:r>
+          </w:p>
+        </w:tc>
+        <w:tc>
+          <w:tcPr>
+            <w:tcW w:w="1500" w:type="dxa"/>
+            <w:tcMar>
+              <w:top w:w="60" w:type="dxa"/>
+              <w:left w:w="80" w:type="dxa"/>
+              <w:bottom w:w="60" w:type="dxa"/>
+              <w:right w:w="80" w:type="dxa"/>
+            </w:tcMar>
+            <w:vAlign w:val="center"/>
+          </w:tcPr>
+          <w:p>
+            <w:pPr>
+              <w:spacing w:after="0"/>
+              <w:rPr>
+                <w:sz w:val="18"/>
+              </w:rPr>
+            </w:pPr>
+            <w:r>
+              <w:rPr>
+                <w:sz w:val="18"/>
+                <w:szCs w:val="18"/>
+              </w:rPr>
+              <w:t xml:space="preserve">Zhang et al. [7]</w:t>
+            </w:r>
+          </w:p>
+        </w:tc>
+        <w:tc>
+          <w:tcPr>
+            <w:tcW w:w="1050" w:type="dxa"/>
+            <w:tcMar>
+              <w:top w:w="60" w:type="dxa"/>
+              <w:left w:w="80" w:type="dxa"/>
+              <w:bottom w:w="60" w:type="dxa"/>
+              <w:right w:w="80" w:type="dxa"/>
+            </w:tcMar>
+            <w:vAlign w:val="center"/>
+          </w:tcPr>
+          <w:p>
+            <w:pPr>
+              <w:spacing w:after="0"/>
+              <w:rPr>
+                <w:sz w:val="18"/>
+              </w:rPr>
+            </w:pPr>
+            <w:r>
+              <w:rPr>
+                <w:sz w:val="18"/>
+                <w:szCs w:val="18"/>
+              </w:rPr>
+              <w:t xml:space="preserve">Agentic image</w:t>
+            </w:r>
+          </w:p>
+        </w:tc>
+        <w:tc>
+          <w:tcPr>
+            <w:tcW w:w="2500" w:type="dxa"/>
+            <w:tcMar>
+              <w:top w:w="60" w:type="dxa"/>
+              <w:left w:w="80" w:type="dxa"/>
+              <w:bottom w:w="60" w:type="dxa"/>
+              <w:right w:w="80" w:type="dxa"/>
+            </w:tcMar>
+            <w:vAlign w:val="center"/>
+          </w:tcPr>
+          <w:p>
+            <w:pPr>
+              <w:spacing w:after="0"/>
+              <w:rPr>
+                <w:sz w:val="18"/>
+              </w:rPr>
+            </w:pPr>
+            <w:r>
+              <w:rPr>
+                <w:sz w:val="18"/>
+                <w:szCs w:val="18"/>
+              </w:rPr>
+              <w:t xml:space="preserve">ForenAgent: a multimodal model calls low-level forensic tools in a loop</w:t>
+            </w:r>
+          </w:p>
+        </w:tc>
+        <w:tc>
+          <w:tcPr>
+            <w:tcW w:w="2200" w:type="dxa"/>
+            <w:tcMar>
+              <w:top w:w="60" w:type="dxa"/>
+              <w:left w:w="80" w:type="dxa"/>
+              <w:bottom w:w="60" w:type="dxa"/>
+              <w:right w:w="80" w:type="dxa"/>
+            </w:tcMar>
+            <w:vAlign w:val="center"/>
+          </w:tcPr>
+          <w:p>
+            <w:pPr>
+              <w:spacing w:after="0"/>
+              <w:rPr>
+                <w:sz w:val="18"/>
+              </w:rPr>
+            </w:pPr>
+            <w:r>
+              <w:rPr>
+                <w:sz w:val="18"/>
+                <w:szCs w:val="18"/>
+              </w:rPr>
+              <w:t xml:space="preserve">Adaptive tool use helps on hard forgeries</w:t>
+            </w:r>
+          </w:p>
+        </w:tc>
+        <w:tc>
+          <w:tcPr>
+            <w:tcW w:w="2000" w:type="dxa"/>
+            <w:tcMar>
+              <w:top w:w="60" w:type="dxa"/>
+              <w:left w:w="80" w:type="dxa"/>
+              <w:bottom w:w="60" w:type="dxa"/>
+              <w:right w:w="80" w:type="dxa"/>
+            </w:tcMar>
+            <w:vAlign w:val="center"/>
+          </w:tcPr>
+          <w:p>
+            <w:pPr>
+              <w:spacing w:after="0"/>
+              <w:rPr>
+                <w:sz w:val="18"/>
+              </w:rPr>
+            </w:pPr>
+            <w:r>
+              <w:rPr>
+                <w:sz w:val="18"/>
+                <w:szCs w:val="18"/>
+              </w:rPr>
+              <w:t xml:space="preserve">Latency and reliability of the loop are unresolved</w:t>
             </w:r>
           </w:p>
         </w:tc>
       </w:tr>
       <w:tr>
         <w:trPr>
+          <w:cantSplit/>
           <w:jc w:val="center"/>
         </w:trPr>
         <w:tc>
           <w:tcPr>
-            <w:tcW w:w="1656" w:type="dxa"/>
-          </w:tcPr>
-          <w:p>
-            <w:pPr>
-              <w:rPr>
-                <w:sz w:val="24"/>
-                <w:szCs w:val="24"/>
-              </w:rPr>
-            </w:pPr>
-            <w:r>
-              <w:rPr>
-                <w:sz w:val="24"/>
-                <w:szCs w:val="24"/>
-              </w:rPr>
-              <w:t>2026</w:t>
-            </w:r>
-          </w:p>
-        </w:tc>
-        <w:tc>
-          <w:tcPr>
-            <w:tcW w:w="1656" w:type="dxa"/>
-          </w:tcPr>
-          <w:p>
-            <w:pPr>
-              <w:rPr>
-                <w:sz w:val="24"/>
-                <w:szCs w:val="24"/>
-              </w:rPr>
-            </w:pPr>
-            <w:r>
-              <w:rPr>
-                <w:sz w:val="24"/>
-                <w:szCs w:val="24"/>
-              </w:rPr>
-              <w:t>Wang et al. [8]</w:t>
-            </w:r>
-          </w:p>
-        </w:tc>
-        <w:tc>
-          <w:tcPr>
-            <w:tcW w:w="1656" w:type="dxa"/>
-          </w:tcPr>
-          <w:p>
-            <w:pPr>
-              <w:rPr>
-                <w:sz w:val="24"/>
-                <w:szCs w:val="24"/>
-              </w:rPr>
-            </w:pPr>
-            <w:r>
-              <w:rPr>
-                <w:sz w:val="24"/>
-                <w:szCs w:val="24"/>
-              </w:rPr>
-              <w:t>Image reasoning</w:t>
-            </w:r>
-          </w:p>
-        </w:tc>
-        <w:tc>
-          <w:tcPr>
-            <w:tcW w:w="1656" w:type="dxa"/>
-          </w:tcPr>
-          <w:p>
-            <w:pPr>
-              <w:rPr>
-                <w:sz w:val="24"/>
-                <w:szCs w:val="24"/>
-              </w:rPr>
-            </w:pPr>
-            <w:r>
-              <w:rPr>
-                <w:sz w:val="24"/>
-                <w:szCs w:val="24"/>
-              </w:rPr>
-              <w:t>LaP-Forensics: RGB + reconstruction residual reasoning</w:t>
-            </w:r>
-          </w:p>
-        </w:tc>
-        <w:tc>
-          <w:tcPr>
-            <w:tcW w:w="1656" w:type="dxa"/>
-          </w:tcPr>
-          <w:p>
-            <w:pPr>
-              <w:rPr>
-                <w:sz w:val="24"/>
-                <w:szCs w:val="24"/>
-              </w:rPr>
-            </w:pPr>
-            <w:r>
-              <w:rPr>
-                <w:sz w:val="24"/>
-                <w:szCs w:val="24"/>
-              </w:rPr>
-              <w:t>Residual evidence helps cross-generator analysis</w:t>
-            </w:r>
-          </w:p>
-        </w:tc>
-        <w:tc>
-          <w:tcPr>
-            <w:tcW w:w="1656" w:type="dxa"/>
-          </w:tcPr>
-          <w:p>
-            <w:pPr>
-              <w:rPr>
-                <w:sz w:val="24"/>
-                <w:szCs w:val="24"/>
-              </w:rPr>
-            </w:pPr>
-            <w:r>
-              <w:rPr>
-                <w:sz w:val="24"/>
-                <w:szCs w:val="24"/>
-              </w:rPr>
-              <w:t>Free-form explanation faithfulness remains an open issue</w:t>
+            <w:tcW w:w="650" w:type="dxa"/>
+            <w:tcMar>
+              <w:top w:w="60" w:type="dxa"/>
+              <w:left w:w="80" w:type="dxa"/>
+              <w:bottom w:w="60" w:type="dxa"/>
+              <w:right w:w="80" w:type="dxa"/>
+            </w:tcMar>
+            <w:vAlign w:val="center"/>
+          </w:tcPr>
+          <w:p>
+            <w:pPr>
+              <w:spacing w:after="0"/>
+              <w:rPr>
+                <w:sz w:val="18"/>
+              </w:rPr>
+            </w:pPr>
+            <w:r>
+              <w:rPr>
+                <w:sz w:val="18"/>
+                <w:szCs w:val="18"/>
+              </w:rPr>
+              <w:t xml:space="preserve">2026</w:t>
+            </w:r>
+          </w:p>
+        </w:tc>
+        <w:tc>
+          <w:tcPr>
+            <w:tcW w:w="1500" w:type="dxa"/>
+            <w:tcMar>
+              <w:top w:w="60" w:type="dxa"/>
+              <w:left w:w="80" w:type="dxa"/>
+              <w:bottom w:w="60" w:type="dxa"/>
+              <w:right w:w="80" w:type="dxa"/>
+            </w:tcMar>
+            <w:vAlign w:val="center"/>
+          </w:tcPr>
+          <w:p>
+            <w:pPr>
+              <w:spacing w:after="0"/>
+              <w:rPr>
+                <w:sz w:val="18"/>
+              </w:rPr>
+            </w:pPr>
+            <w:r>
+              <w:rPr>
+                <w:sz w:val="18"/>
+                <w:szCs w:val="18"/>
+              </w:rPr>
+              <w:t xml:space="preserve">Wang et al. [8]</w:t>
+            </w:r>
+          </w:p>
+        </w:tc>
+        <w:tc>
+          <w:tcPr>
+            <w:tcW w:w="1050" w:type="dxa"/>
+            <w:tcMar>
+              <w:top w:w="60" w:type="dxa"/>
+              <w:left w:w="80" w:type="dxa"/>
+              <w:bottom w:w="60" w:type="dxa"/>
+              <w:right w:w="80" w:type="dxa"/>
+            </w:tcMar>
+            <w:vAlign w:val="center"/>
+          </w:tcPr>
+          <w:p>
+            <w:pPr>
+              <w:spacing w:after="0"/>
+              <w:rPr>
+                <w:sz w:val="18"/>
+              </w:rPr>
+            </w:pPr>
+            <w:r>
+              <w:rPr>
+                <w:sz w:val="18"/>
+                <w:szCs w:val="18"/>
+              </w:rPr>
+              <w:t xml:space="preserve">Image reasoning</w:t>
+            </w:r>
+          </w:p>
+        </w:tc>
+        <w:tc>
+          <w:tcPr>
+            <w:tcW w:w="2500" w:type="dxa"/>
+            <w:tcMar>
+              <w:top w:w="60" w:type="dxa"/>
+              <w:left w:w="80" w:type="dxa"/>
+              <w:bottom w:w="60" w:type="dxa"/>
+              <w:right w:w="80" w:type="dxa"/>
+            </w:tcMar>
+            <w:vAlign w:val="center"/>
+          </w:tcPr>
+          <w:p>
+            <w:pPr>
+              <w:spacing w:after="0"/>
+              <w:rPr>
+                <w:sz w:val="18"/>
+              </w:rPr>
+            </w:pPr>
+            <w:r>
+              <w:rPr>
+                <w:sz w:val="18"/>
+                <w:szCs w:val="18"/>
+              </w:rPr>
+              <w:t xml:space="preserve">LaP-Forensics: RGB plus reconstruction residuals for reasoning</w:t>
+            </w:r>
+          </w:p>
+        </w:tc>
+        <w:tc>
+          <w:tcPr>
+            <w:tcW w:w="2200" w:type="dxa"/>
+            <w:tcMar>
+              <w:top w:w="60" w:type="dxa"/>
+              <w:left w:w="80" w:type="dxa"/>
+              <w:bottom w:w="60" w:type="dxa"/>
+              <w:right w:w="80" w:type="dxa"/>
+            </w:tcMar>
+            <w:vAlign w:val="center"/>
+          </w:tcPr>
+          <w:p>
+            <w:pPr>
+              <w:spacing w:after="0"/>
+              <w:rPr>
+                <w:sz w:val="18"/>
+              </w:rPr>
+            </w:pPr>
+            <w:r>
+              <w:rPr>
+                <w:sz w:val="18"/>
+                <w:szCs w:val="18"/>
+              </w:rPr>
+              <w:t xml:space="preserve">Residuals help across unseen generators</w:t>
+            </w:r>
+          </w:p>
+        </w:tc>
+        <w:tc>
+          <w:tcPr>
+            <w:tcW w:w="2000" w:type="dxa"/>
+            <w:tcMar>
+              <w:top w:w="60" w:type="dxa"/>
+              <w:left w:w="80" w:type="dxa"/>
+              <w:bottom w:w="60" w:type="dxa"/>
+              <w:right w:w="80" w:type="dxa"/>
+            </w:tcMar>
+            <w:vAlign w:val="center"/>
+          </w:tcPr>
+          <w:p>
+            <w:pPr>
+              <w:spacing w:after="0"/>
+              <w:rPr>
+                <w:sz w:val="18"/>
+              </w:rPr>
+            </w:pPr>
+            <w:r>
+              <w:rPr>
+                <w:sz w:val="18"/>
+                <w:szCs w:val="18"/>
+              </w:rPr>
+              <w:t xml:space="preserve">Whether free-text explanations are faithful is open</w:t>
             </w:r>
           </w:p>
         </w:tc>
       </w:tr>
     </w:tbl>
+    <w:p>
+      <w:pPr>
+        <w:spacing w:after="60"/>
+        <w:rPr>
+          <w:sz w:val="12"/>
+        </w:rPr>
+      </w:pPr>
+    </w:p>
     <w:p>
       <w:pPr>
         <w:rPr>
@@ -8386,7 +8741,6 @@
       <w:pPr>
         <w:rPr>
           <w:sz w:val="24"/>
-          <w:szCs w:val="24"/>
         </w:rPr>
       </w:pPr>
       <w:r>
@@ -8394,37 +8748,66 @@
           <w:sz w:val="24"/>
           <w:szCs w:val="24"/>
         </w:rPr>
-        <w:t>Several consistent conclusions emerge from the reviewed work. First, detection performance should be treated as distribution-dependent. RAID shows that machine-generated text detectors can be affected by adversarial modification, sampling changes and unseen generators [1]. In image forensics, the move from controlled benchmarks such as FaceForensics++ to WildDeepfake similarly highlights the difficulty of real-world generalization [4], [5].</w:t>
+        <w:t xml:space="preserve">Three points follow from the literature. </w:t>
+      </w:r>
+      <w:r>
+        <w:rPr>
+          <w:b/>
+          <w:sz w:val="24"/>
+          <w:szCs w:val="24"/>
+        </w:rPr>
+        <w:t xml:space="preserve">Accuracy depends on the data:</w:t>
+      </w:r>
+      <w:r>
+        <w:rPr>
+          <w:sz w:val="24"/>
+          <w:szCs w:val="24"/>
+        </w:rPr>
+        <w:t xml:space="preserve"> RAID shows detectors weakening under paraphrasing, unfamiliar sampling settings and generators they never saw [1], and the step from FaceForensics++ to WildDeepfake shows the same for faces [4], [5].</w:t>
       </w:r>
     </w:p>
     <w:p>
       <w:pPr>
         <w:rPr>
           <w:sz w:val="24"/>
-          <w:szCs w:val="24"/>
         </w:rPr>
       </w:pPr>
       <w:r>
         <w:rPr>
+          <w:b/>
           <w:sz w:val="24"/>
           <w:szCs w:val="24"/>
         </w:rPr>
-        <w:t>Second, different forensic signals are complementary. Text can be examined through stylometric regularities, model-based statistical behavior and learned semantic representations. Images can be examined through RGB artifacts, spectral/residual patterns and semantic inconsistencies. Recent work such as ForenAgent explicitly explores the benefit of combining high-level reasoning with low-level forensic tools [7], while LaP-Forensics shows the value of adding reconstruction-derived evidence to RGB reasoning [8].</w:t>
+        <w:t xml:space="preserve">The signals complement each other.</w:t>
+      </w:r>
+      <w:r>
+        <w:rPr>
+          <w:sz w:val="24"/>
+          <w:szCs w:val="24"/>
+        </w:rPr>
+        <w:t xml:space="preserve"> For text, style statistics, model likelihoods and learned representations fail in different places; for images, pixel artefacts, frequency patterns and semantic oddities do the same. ForenAgent combines high-level reasoning with low-level tools [7], and LaP-Forensics adds reconstruction residuals to RGB evidence [8].</w:t>
       </w:r>
     </w:p>
     <w:p>
       <w:pPr>
         <w:rPr>
           <w:sz w:val="24"/>
-          <w:szCs w:val="24"/>
         </w:rPr>
       </w:pPr>
       <w:r>
         <w:rPr>
+          <w:b/>
           <w:sz w:val="24"/>
           <w:szCs w:val="24"/>
         </w:rPr>
-        <w:t>Third, explanation must be tied to evidence. RAG provides a useful design pattern because it gives the reasoning layer access to an external, updateable knowledge source rather than forcing all knowledge to reside inside the language model [6]. For a forensic system, however, retrieval alone is not enough; the system also needs to expose tool outputs, confidence and uncertainty.</w:t>
+        <w:t xml:space="preserve">An explanation is only useful when it points to evidence.</w:t>
+      </w:r>
+      <w:r>
+        <w:rPr>
+          <w:sz w:val="24"/>
+          <w:szCs w:val="24"/>
+        </w:rPr>
+        <w:t xml:space="preserve"> Retrieval lets a system cite an external, updatable source instead of relying on what a model memorised [6], but citations alone do not show how sure the system is, so the individual tool readings and the uncertainty must be shown as well.</w:t>
       </w:r>
     </w:p>
     <w:p>
@@ -8445,15 +8828,22 @@
       <w:pPr>
         <w:rPr>
           <w:sz w:val="24"/>
-          <w:szCs w:val="24"/>
         </w:rPr>
       </w:pPr>
       <w:r>
         <w:rPr>
+          <w:b/>
           <w:sz w:val="24"/>
           <w:szCs w:val="24"/>
         </w:rPr>
-        <w:t>Research Gap: Existing work is largely organized around individual detectors, a single modality, or a specific reasoning framework. The proposed project studies whether a unified text-and-image forensic workflow can combine complementary tools through agentic orchestration, ground the interpretation in retrieved forensic knowledge, and explicitly verify disagreement before issuing a report. The novelty therefore lies in the integration and evaluation of the complete investigation process rather than claiming a new base classifier for every modality.</w:t>
+        <w:t xml:space="preserve">Research gap.</w:t>
+      </w:r>
+      <w:r>
+        <w:rPr>
+          <w:sz w:val="24"/>
+          <w:szCs w:val="24"/>
+        </w:rPr>
+        <w:t xml:space="preserve"> Prior work mostly addresses one detector, one modality or one reasoning method. What is missing is a single text-and-image workflow in which a controller chooses the tools, interpretations are tied to retrieved knowledge, and disagreement is checked before anything is reported. The contribution sought here is that integrated, measured workflow, not a new base classifier for each modality.</w:t>
       </w:r>
     </w:p>
     <w:p>
@@ -8475,197 +8865,208 @@
     <w:tbl>
       <w:tblPr>
         <w:tblStyle w:val="TableGrid"/>
-        <w:tblW w:w="0" w:type="auto"/>
+        <w:tblW w:w="9800" w:type="dxa"/>
         <w:jc w:val="center"/>
+        <w:tblLayout w:type="fixed"/>
         <w:tblLook w:val="04A0" w:firstRow="1" w:lastRow="0" w:firstColumn="1" w:lastColumn="0" w:noHBand="0" w:noVBand="1"/>
       </w:tblPr>
       <w:tblGrid>
-        <w:gridCol w:w="4968"/>
-        <w:gridCol w:w="4968"/>
+        <w:gridCol w:w="4900"/>
+        <w:gridCol w:w="4900"/>
       </w:tblGrid>
       <w:tr>
         <w:trPr>
+          <w:cantSplit/>
           <w:jc w:val="center"/>
         </w:trPr>
         <w:tc>
           <w:tcPr>
-            <w:tcW w:w="4968" w:type="dxa"/>
-            <w:tcMar>
-              <w:top w:w="90" w:type="dxa"/>
-              <w:left w:w="90" w:type="dxa"/>
-              <w:bottom w:w="90" w:type="dxa"/>
-              <w:right w:w="90" w:type="dxa"/>
-            </w:tcMar>
-            <w:vAlign w:val="center"/>
-          </w:tcPr>
-          <w:p>
-            <w:pPr>
-              <w:rPr>
-                <w:sz w:val="24"/>
-                <w:szCs w:val="24"/>
+            <w:tcW w:w="4900" w:type="dxa"/>
+            <w:tcMar>
+              <w:top w:w="60" w:type="dxa"/>
+              <w:left w:w="80" w:type="dxa"/>
+              <w:bottom w:w="60" w:type="dxa"/>
+              <w:right w:w="80" w:type="dxa"/>
+            </w:tcMar>
+            <w:vAlign w:val="center"/>
+          </w:tcPr>
+          <w:p>
+            <w:pPr>
+              <w:spacing w:after="0"/>
+              <w:rPr>
+                <w:sz w:val="20"/>
               </w:rPr>
             </w:pPr>
             <w:r>
               <w:rPr>
                 <w:b/>
-                <w:sz w:val="24"/>
-                <w:szCs w:val="24"/>
-              </w:rPr>
-              <w:t>Strengths</w:t>
-            </w:r>
+                <w:sz w:val="20"/>
+                <w:szCs w:val="20"/>
+              </w:rPr>
+              <w:t xml:space="preserve">Strengths</w:t>
+            </w:r>
+          </w:p>
+          <w:p>
+            <w:pPr>
+              <w:spacing w:after="0"/>
+              <w:rPr>
+                <w:sz w:val="20"/>
+              </w:rPr>
+            </w:pPr>
+            <w:r>
+              <w:rPr>
+                <w:sz w:val="20"/>
+                <w:szCs w:val="20"/>
+              </w:rPr>
+              <w:t xml:space="preserve">Several independent signals; tools can be swapped; reports show their evidence; uncertainty is explicit.</w:t>
+            </w:r>
+          </w:p>
+        </w:tc>
+        <w:tc>
+          <w:tcPr>
+            <w:tcW w:w="4900" w:type="dxa"/>
+            <w:tcMar>
+              <w:top w:w="60" w:type="dxa"/>
+              <w:left w:w="80" w:type="dxa"/>
+              <w:bottom w:w="60" w:type="dxa"/>
+              <w:right w:w="80" w:type="dxa"/>
+            </w:tcMar>
+            <w:vAlign w:val="center"/>
+          </w:tcPr>
+          <w:p>
+            <w:pPr>
+              <w:spacing w:after="0"/>
+              <w:rPr>
+                <w:sz w:val="20"/>
+              </w:rPr>
+            </w:pPr>
             <w:r>
               <w:rPr>
                 <w:b/>
-                <w:sz w:val="24"/>
-                <w:szCs w:val="24"/>
-              </w:rPr>
-              <w:br/>
-            </w:r>
-            <w:r>
-              <w:rPr>
-                <w:sz w:val="24"/>
-                <w:szCs w:val="24"/>
-              </w:rPr>
-              <w:t>Multi-signal evidence; modular tools; explainable reports; explicit uncertainty handling.</w:t>
-            </w:r>
-          </w:p>
-        </w:tc>
-        <w:tc>
-          <w:tcPr>
-            <w:tcW w:w="4968" w:type="dxa"/>
-            <w:tcMar>
-              <w:top w:w="90" w:type="dxa"/>
-              <w:left w:w="90" w:type="dxa"/>
-              <w:bottom w:w="90" w:type="dxa"/>
-              <w:right w:w="90" w:type="dxa"/>
-            </w:tcMar>
-            <w:vAlign w:val="center"/>
-          </w:tcPr>
-          <w:p>
-            <w:pPr>
-              <w:rPr>
-                <w:sz w:val="24"/>
-                <w:szCs w:val="24"/>
-              </w:rPr>
-            </w:pPr>
-            <w:r>
-              <w:rPr>
-                <w:b/>
-                <w:sz w:val="24"/>
-                <w:szCs w:val="24"/>
-              </w:rPr>
-              <w:t>Weaknesses</w:t>
-            </w:r>
-            <w:r>
-              <w:rPr>
-                <w:b/>
-                <w:sz w:val="24"/>
-                <w:szCs w:val="24"/>
-              </w:rPr>
-              <w:br/>
-            </w:r>
-            <w:r>
-              <w:rPr>
-                <w:sz w:val="24"/>
-                <w:szCs w:val="24"/>
-              </w:rPr>
-              <w:t>Multiple models increase latency; confidence calibration is difficult; RAG depends on knowledge-base quality.</w:t>
+                <w:sz w:val="20"/>
+                <w:szCs w:val="20"/>
+              </w:rPr>
+              <w:t xml:space="preserve">Weaknesses</w:t>
+            </w:r>
+          </w:p>
+          <w:p>
+            <w:pPr>
+              <w:spacing w:after="0"/>
+              <w:rPr>
+                <w:sz w:val="20"/>
+              </w:rPr>
+            </w:pPr>
+            <w:r>
+              <w:rPr>
+                <w:sz w:val="20"/>
+                <w:szCs w:val="20"/>
+              </w:rPr>
+              <w:t xml:space="preserve">More models mean more latency; confidence is hard to calibrate; retrieval is only as good as the notes.</w:t>
             </w:r>
           </w:p>
         </w:tc>
       </w:tr>
       <w:tr>
         <w:trPr>
+          <w:cantSplit/>
           <w:jc w:val="center"/>
         </w:trPr>
         <w:tc>
           <w:tcPr>
-            <w:tcW w:w="4968" w:type="dxa"/>
-            <w:tcMar>
-              <w:top w:w="90" w:type="dxa"/>
-              <w:left w:w="90" w:type="dxa"/>
-              <w:bottom w:w="90" w:type="dxa"/>
-              <w:right w:w="90" w:type="dxa"/>
-            </w:tcMar>
-            <w:vAlign w:val="center"/>
-          </w:tcPr>
-          <w:p>
-            <w:pPr>
-              <w:rPr>
-                <w:sz w:val="24"/>
-                <w:szCs w:val="24"/>
+            <w:tcW w:w="4900" w:type="dxa"/>
+            <w:tcMar>
+              <w:top w:w="60" w:type="dxa"/>
+              <w:left w:w="80" w:type="dxa"/>
+              <w:bottom w:w="60" w:type="dxa"/>
+              <w:right w:w="80" w:type="dxa"/>
+            </w:tcMar>
+            <w:vAlign w:val="center"/>
+          </w:tcPr>
+          <w:p>
+            <w:pPr>
+              <w:spacing w:after="0"/>
+              <w:rPr>
+                <w:sz w:val="20"/>
               </w:rPr>
             </w:pPr>
             <w:r>
               <w:rPr>
                 <w:b/>
-                <w:sz w:val="24"/>
-                <w:szCs w:val="24"/>
-              </w:rPr>
-              <w:t>Opportunities</w:t>
-            </w:r>
+                <w:sz w:val="20"/>
+                <w:szCs w:val="20"/>
+              </w:rPr>
+              <w:t xml:space="preserve">Opportunities</w:t>
+            </w:r>
+          </w:p>
+          <w:p>
+            <w:pPr>
+              <w:spacing w:after="0"/>
+              <w:rPr>
+                <w:sz w:val="20"/>
+              </w:rPr>
+            </w:pPr>
+            <w:r>
+              <w:rPr>
+                <w:sz w:val="20"/>
+                <w:szCs w:val="20"/>
+              </w:rPr>
+              <w:t xml:space="preserve">Video analysis; watermark and provenance services; learning from human-verified cases; use in organisational forensic workflows.</w:t>
+            </w:r>
+          </w:p>
+        </w:tc>
+        <w:tc>
+          <w:tcPr>
+            <w:tcW w:w="4900" w:type="dxa"/>
+            <w:tcMar>
+              <w:top w:w="60" w:type="dxa"/>
+              <w:left w:w="80" w:type="dxa"/>
+              <w:bottom w:w="60" w:type="dxa"/>
+              <w:right w:w="80" w:type="dxa"/>
+            </w:tcMar>
+            <w:vAlign w:val="center"/>
+          </w:tcPr>
+          <w:p>
+            <w:pPr>
+              <w:spacing w:after="0"/>
+              <w:rPr>
+                <w:sz w:val="20"/>
+              </w:rPr>
+            </w:pPr>
             <w:r>
               <w:rPr>
                 <w:b/>
-                <w:sz w:val="24"/>
-                <w:szCs w:val="24"/>
-              </w:rPr>
-              <w:br/>
-            </w:r>
-            <w:r>
-              <w:rPr>
-                <w:sz w:val="24"/>
-                <w:szCs w:val="24"/>
-              </w:rPr>
-              <w:t>Video extension; watermark/provenance services; continuous learning from verified cases; enterprise forensic workflows.</w:t>
-            </w:r>
-          </w:p>
-        </w:tc>
-        <w:tc>
-          <w:tcPr>
-            <w:tcW w:w="4968" w:type="dxa"/>
-            <w:tcMar>
-              <w:top w:w="90" w:type="dxa"/>
-              <w:left w:w="90" w:type="dxa"/>
-              <w:bottom w:w="90" w:type="dxa"/>
-              <w:right w:w="90" w:type="dxa"/>
-            </w:tcMar>
-            <w:vAlign w:val="center"/>
-          </w:tcPr>
-          <w:p>
-            <w:pPr>
-              <w:rPr>
-                <w:sz w:val="24"/>
-                <w:szCs w:val="24"/>
-              </w:rPr>
-            </w:pPr>
-            <w:r>
-              <w:rPr>
-                <w:b/>
-                <w:sz w:val="24"/>
-                <w:szCs w:val="24"/>
-              </w:rPr>
-              <w:t>Threats</w:t>
-            </w:r>
-            <w:r>
-              <w:rPr>
-                <w:b/>
-                <w:sz w:val="24"/>
-                <w:szCs w:val="24"/>
-              </w:rPr>
-              <w:br/>
-            </w:r>
-            <w:r>
-              <w:rPr>
-                <w:sz w:val="24"/>
-                <w:szCs w:val="24"/>
-              </w:rPr>
-              <w:t>Rapidly changing generators; adversarial evasion; poisoned retrieval content; privacy and legal evidence requirements.</w:t>
+                <w:sz w:val="20"/>
+                <w:szCs w:val="20"/>
+              </w:rPr>
+              <w:t xml:space="preserve">Threats</w:t>
+            </w:r>
+          </w:p>
+          <w:p>
+            <w:pPr>
+              <w:spacing w:after="0"/>
+              <w:rPr>
+                <w:sz w:val="20"/>
+              </w:rPr>
+            </w:pPr>
+            <w:r>
+              <w:rPr>
+                <w:sz w:val="20"/>
+                <w:szCs w:val="20"/>
+              </w:rPr>
+              <w:t xml:space="preserve">Fast-moving generators; deliberate evasion; tampered retrieval content; privacy and legal requirements on evidence.</w:t>
             </w:r>
           </w:p>
         </w:tc>
       </w:tr>
     </w:tbl>
+    <w:p>
+      <w:pPr>
+        <w:spacing w:after="60"/>
+        <w:rPr>
+          <w:sz w:val="12"/>
+        </w:rPr>
+      </w:pPr>
+    </w:p>
     <w:p>
       <w:pPr>
         <w:rPr>
@@ -8726,7 +9127,7 @@
           <w:sz w:val="24"/>
           <w:szCs w:val="24"/>
         </w:rPr>
-        <w:t xml:space="preserve">The framework follows a layered architecture so that model inference, agent decisions, retrieval and user-facing services remain separate. A request enters through the API layer, which validates the input by content (file type, size, dimensions, length) and applies an optional access key and rate limit. The orchestrator identifies the modality and creates a shared investigation state. Specialist tools append structured observations (score, confidence, explanation). Reference material is retrieved, the verifier reconciles the observations, and the report generator prepares the result. Low-confidence or conflicting cases are marked for human review.</w:t>
+        <w:t xml:space="preserve">The system is split into layers so that model inference, agent decisions, retrieval and the user-facing service can change independently. A request first reaches the API, which checks the input by content (file type, size, dimensions, length) and applies an optional access key and rate limit. The orchestrator then determines the modality and opens a shared investigation state, to which each specialist tool adds a structured observation of score, confidence and explanation. Reference material is retrieved, the verifier reconciles the observations, and the report generator writes the result; a case whose tools conflict or stay unsure is flagged for a human examiner.</w:t>
       </w:r>
     </w:p>
     <w:p>
@@ -11982,7 +12383,7 @@
                 <w:sz w:val="19"/>
                 <w:szCs w:val="19"/>
               </w:rPr>
-              <w:t xml:space="preserve">Web interface, API with key and rate limit, SQLite audit store, Docker</w:t>
+              <w:t xml:space="preserve">Web interface with a print-ready case record (save as PDF), API with key and rate limit, SQLite audit store, Docker</w:t>
             </w:r>
           </w:p>
         </w:tc>
@@ -12009,7 +12410,7 @@
                 <w:sz w:val="19"/>
                 <w:szCs w:val="19"/>
               </w:rPr>
-              <w:t xml:space="preserve">Report export (PDF)</w:t>
+              <w:t xml:space="preserve">Server-side PDF export (optional)</w:t>
             </w:r>
           </w:p>
         </w:tc>
@@ -17598,7 +17999,7 @@
           <w:sz w:val="24"/>
           <w:szCs w:val="24"/>
         </w:rPr>
-        <w:t xml:space="preserve">Add PDF export of the case record and finalise the project report and demonstration.</w:t>
+        <w:t xml:space="preserve">Finalise the project report and the demonstration; optional server-side PDF export of a case record.</w:t>
       </w:r>
     </w:p>
     <w:p>
@@ -17630,7 +18031,7 @@
           <w:sz w:val="24"/>
           <w:szCs w:val="24"/>
         </w:rPr>
-        <w:t>Video deepfake detection using temporal consistency, motion and frame-level artifact analysis.</w:t>
+        <w:t xml:space="preserve">Video deepfake detection using temporal consistency and frame-level artefacts.</w:t>
       </w:r>
     </w:p>
     <w:p>
@@ -17646,7 +18047,7 @@
           <w:sz w:val="24"/>
           <w:szCs w:val="24"/>
         </w:rPr>
-        <w:t>Adaptation of the team’s prior spatial-temporal video modeling experience for a dedicated video forensic agent.</w:t>
+        <w:t xml:space="preserve">A separate video agent that reuses the team's earlier work on spatio-temporal video models.</w:t>
       </w:r>
     </w:p>
     <w:p>
@@ -17662,7 +18063,7 @@
           <w:sz w:val="24"/>
           <w:szCs w:val="24"/>
         </w:rPr>
-        <w:t>Invisible watermarking and provenance verification for images and video generated through trusted workflows.</w:t>
+        <w:t xml:space="preserve">Provenance checks and invisible watermarks for media from trusted pipelines.</w:t>
       </w:r>
     </w:p>
     <w:p>
@@ -17678,7 +18079,7 @@
           <w:sz w:val="24"/>
           <w:szCs w:val="24"/>
         </w:rPr>
-        <w:t>Model and retrieval observability using trace-based monitoring and continuous evaluation.</w:t>
+        <w:t xml:space="preserve">Tracing and continuous evaluation of the models and the retrieval step.</w:t>
       </w:r>
     </w:p>
     <w:p>
@@ -17694,7 +18095,7 @@
           <w:sz w:val="24"/>
           <w:szCs w:val="24"/>
         </w:rPr>
-        <w:t>Signed evidence logs and stronger chain-of-custody controls for forensic deployments.</w:t>
+        <w:t xml:space="preserve">Signed evidence logs and a stronger chain of custody.</w:t>
       </w:r>
     </w:p>
     <w:p>
@@ -17710,7 +18111,7 @@
           <w:sz w:val="24"/>
           <w:szCs w:val="24"/>
         </w:rPr>
-        <w:t>On-premise or edge deployment for sensitive evidence where cloud processing is unsuitable.</w:t>
+        <w:t xml:space="preserve">On-premise or edge deployment where evidence cannot be sent to a cloud service.</w:t>
       </w:r>
     </w:p>
     <w:p>
@@ -17726,7 +18127,7 @@
           <w:sz w:val="24"/>
           <w:szCs w:val="24"/>
         </w:rPr>
-        <w:t>Expansion of the RAG corpus with verified cases and controlled feedback from human analysts.</w:t>
+        <w:t xml:space="preserve">A larger knowledge base fed by verified cases and analyst feedback.</w:t>
       </w:r>
     </w:p>
     <w:p>

</xml_diff>

<commit_message>
Report: add degraded-image threshold results to Section 5.3 and the end-semester plan
Co-Authored-By: Claude Sonnet 5.5 <noreply@anthropic.com>
</commit_message>
<xml_diff>
--- a/Mid_Semester_Report_Agentic_RAG_Digital_Forensics.docx
+++ b/Mid_Semester_Report_Agentic_RAG_Digital_Forensics.docx
@@ -3554,7 +3554,7 @@
                 <w:sz w:val="21"/>
                 <w:szCs w:val="21"/>
               </w:rPr>
-              <w:t xml:space="preserve">20</w:t>
+              <w:t xml:space="preserve">21</w:t>
             </w:r>
           </w:p>
         </w:tc>
@@ -16198,7 +16198,430 @@
           <w:sz w:val="24"/>
           <w:szCs w:val="24"/>
         </w:rPr>
-        <w:t xml:space="preserve">Ranking quality survives on Celeb-DF and WildDeepfake, but the false-alarm rate on real faces rises with degradation and is worst on FaceForensics++. Material that has been re-uploaded or screenshotted therefore needs a human check; a threshold tuned on degraded images is planned.</w:t>
+        <w:t xml:space="preserve">Ranking quality survives on Celeb-DF and WildDeepfake, but the false-alarm rate on real faces rises with degradation and is worst on FaceForensics++. We therefore fitted a second decision threshold on degraded calibration images only (1,000 images, downscaled or screenshot-like) and tested it on the held-out sets. The standard threshold of 0.402 became 0.586.</w:t>
+      </w:r>
+    </w:p>
+    <w:tbl>
+      <w:tblPr>
+        <w:tblStyle w:val="TableGrid"/>
+        <w:tblW w:w="9700" w:type="dxa"/>
+        <w:jc w:val="center"/>
+        <w:tblLayout w:type="fixed"/>
+        <w:tblLook w:val="04A0" w:firstRow="1" w:lastRow="0" w:firstColumn="1" w:lastColumn="0" w:noHBand="0" w:noVBand="1"/>
+      </w:tblPr>
+      <w:tblGrid>
+        <w:gridCol w:w="3300"/>
+        <w:gridCol w:w="3200"/>
+        <w:gridCol w:w="3200"/>
+      </w:tblGrid>
+      <w:tr>
+        <w:trPr>
+          <w:cantSplit/>
+          <w:tblHeader/>
+          <w:jc w:val="center"/>
+        </w:trPr>
+        <w:tc>
+          <w:tcPr>
+            <w:tcW w:w="3300" w:type="dxa"/>
+            <w:shd w:val="clear" w:color="auto" w:fill="D9EAF7"/>
+            <w:tcMar>
+              <w:top w:w="60" w:type="dxa"/>
+              <w:left w:w="80" w:type="dxa"/>
+              <w:bottom w:w="60" w:type="dxa"/>
+              <w:right w:w="80" w:type="dxa"/>
+            </w:tcMar>
+            <w:vAlign w:val="center"/>
+          </w:tcPr>
+          <w:p>
+            <w:pPr>
+              <w:spacing w:after="0"/>
+              <w:rPr>
+                <w:sz w:val="19"/>
+              </w:rPr>
+            </w:pPr>
+            <w:r>
+              <w:rPr>
+                <w:b/>
+                <w:sz w:val="19"/>
+                <w:szCs w:val="19"/>
+              </w:rPr>
+              <w:t xml:space="preserve">Test set, screenshot-like copy</w:t>
+            </w:r>
+          </w:p>
+        </w:tc>
+        <w:tc>
+          <w:tcPr>
+            <w:tcW w:w="3200" w:type="dxa"/>
+            <w:shd w:val="clear" w:color="auto" w:fill="D9EAF7"/>
+            <w:tcMar>
+              <w:top w:w="60" w:type="dxa"/>
+              <w:left w:w="80" w:type="dxa"/>
+              <w:bottom w:w="60" w:type="dxa"/>
+              <w:right w:w="80" w:type="dxa"/>
+            </w:tcMar>
+            <w:vAlign w:val="center"/>
+          </w:tcPr>
+          <w:p>
+            <w:pPr>
+              <w:spacing w:after="0"/>
+              <w:rPr>
+                <w:sz w:val="19"/>
+              </w:rPr>
+            </w:pPr>
+            <w:r>
+              <w:rPr>
+                <w:b/>
+                <w:sz w:val="19"/>
+                <w:szCs w:val="19"/>
+              </w:rPr>
+              <w:t xml:space="preserve">False alarms</w:t>
+            </w:r>
+          </w:p>
+          <w:p>
+            <w:pPr>
+              <w:spacing w:after="0"/>
+              <w:rPr>
+                <w:sz w:val="19"/>
+              </w:rPr>
+            </w:pPr>
+            <w:r>
+              <w:rPr>
+                <w:b/>
+                <w:sz w:val="19"/>
+                <w:szCs w:val="19"/>
+              </w:rPr>
+              <w:t xml:space="preserve">standard → degraded threshold</w:t>
+            </w:r>
+          </w:p>
+        </w:tc>
+        <w:tc>
+          <w:tcPr>
+            <w:tcW w:w="3200" w:type="dxa"/>
+            <w:shd w:val="clear" w:color="auto" w:fill="D9EAF7"/>
+            <w:tcMar>
+              <w:top w:w="60" w:type="dxa"/>
+              <w:left w:w="80" w:type="dxa"/>
+              <w:bottom w:w="60" w:type="dxa"/>
+              <w:right w:w="80" w:type="dxa"/>
+            </w:tcMar>
+            <w:vAlign w:val="center"/>
+          </w:tcPr>
+          <w:p>
+            <w:pPr>
+              <w:spacing w:after="0"/>
+              <w:rPr>
+                <w:sz w:val="19"/>
+              </w:rPr>
+            </w:pPr>
+            <w:r>
+              <w:rPr>
+                <w:b/>
+                <w:sz w:val="19"/>
+                <w:szCs w:val="19"/>
+              </w:rPr>
+              <w:t xml:space="preserve">Fakes caught</w:t>
+            </w:r>
+          </w:p>
+          <w:p>
+            <w:pPr>
+              <w:spacing w:after="0"/>
+              <w:rPr>
+                <w:sz w:val="19"/>
+              </w:rPr>
+            </w:pPr>
+            <w:r>
+              <w:rPr>
+                <w:b/>
+                <w:sz w:val="19"/>
+                <w:szCs w:val="19"/>
+              </w:rPr>
+              <w:t xml:space="preserve">standard → degraded threshold</w:t>
+            </w:r>
+          </w:p>
+        </w:tc>
+      </w:tr>
+      <w:tr>
+        <w:trPr>
+          <w:cantSplit/>
+          <w:jc w:val="center"/>
+        </w:trPr>
+        <w:tc>
+          <w:tcPr>
+            <w:tcW w:w="3300" w:type="dxa"/>
+            <w:tcMar>
+              <w:top w:w="60" w:type="dxa"/>
+              <w:left w:w="80" w:type="dxa"/>
+              <w:bottom w:w="60" w:type="dxa"/>
+              <w:right w:w="80" w:type="dxa"/>
+            </w:tcMar>
+            <w:vAlign w:val="center"/>
+          </w:tcPr>
+          <w:p>
+            <w:pPr>
+              <w:spacing w:after="0"/>
+              <w:rPr>
+                <w:sz w:val="19"/>
+              </w:rPr>
+            </w:pPr>
+            <w:r>
+              <w:rPr>
+                <w:sz w:val="19"/>
+                <w:szCs w:val="19"/>
+              </w:rPr>
+              <w:t xml:space="preserve">Celeb-DF</w:t>
+            </w:r>
+          </w:p>
+        </w:tc>
+        <w:tc>
+          <w:tcPr>
+            <w:tcW w:w="3200" w:type="dxa"/>
+            <w:tcMar>
+              <w:top w:w="60" w:type="dxa"/>
+              <w:left w:w="80" w:type="dxa"/>
+              <w:bottom w:w="60" w:type="dxa"/>
+              <w:right w:w="80" w:type="dxa"/>
+            </w:tcMar>
+            <w:vAlign w:val="center"/>
+          </w:tcPr>
+          <w:p>
+            <w:pPr>
+              <w:spacing w:after="0"/>
+              <w:rPr>
+                <w:sz w:val="19"/>
+              </w:rPr>
+            </w:pPr>
+            <w:r>
+              <w:rPr>
+                <w:sz w:val="19"/>
+                <w:szCs w:val="19"/>
+              </w:rPr>
+              <w:t xml:space="preserve">9% → 4%</w:t>
+            </w:r>
+          </w:p>
+        </w:tc>
+        <w:tc>
+          <w:tcPr>
+            <w:tcW w:w="3200" w:type="dxa"/>
+            <w:tcMar>
+              <w:top w:w="60" w:type="dxa"/>
+              <w:left w:w="80" w:type="dxa"/>
+              <w:bottom w:w="60" w:type="dxa"/>
+              <w:right w:w="80" w:type="dxa"/>
+            </w:tcMar>
+            <w:vAlign w:val="center"/>
+          </w:tcPr>
+          <w:p>
+            <w:pPr>
+              <w:spacing w:after="0"/>
+              <w:rPr>
+                <w:sz w:val="19"/>
+              </w:rPr>
+            </w:pPr>
+            <w:r>
+              <w:rPr>
+                <w:sz w:val="19"/>
+                <w:szCs w:val="19"/>
+              </w:rPr>
+              <w:t xml:space="preserve">98% → 96%</w:t>
+            </w:r>
+          </w:p>
+        </w:tc>
+      </w:tr>
+      <w:tr>
+        <w:trPr>
+          <w:cantSplit/>
+          <w:jc w:val="center"/>
+        </w:trPr>
+        <w:tc>
+          <w:tcPr>
+            <w:tcW w:w="3300" w:type="dxa"/>
+            <w:tcMar>
+              <w:top w:w="60" w:type="dxa"/>
+              <w:left w:w="80" w:type="dxa"/>
+              <w:bottom w:w="60" w:type="dxa"/>
+              <w:right w:w="80" w:type="dxa"/>
+            </w:tcMar>
+            <w:vAlign w:val="center"/>
+          </w:tcPr>
+          <w:p>
+            <w:pPr>
+              <w:spacing w:after="0"/>
+              <w:rPr>
+                <w:sz w:val="19"/>
+              </w:rPr>
+            </w:pPr>
+            <w:r>
+              <w:rPr>
+                <w:sz w:val="19"/>
+                <w:szCs w:val="19"/>
+              </w:rPr>
+              <w:t xml:space="preserve">WildDeepfake</w:t>
+            </w:r>
+          </w:p>
+        </w:tc>
+        <w:tc>
+          <w:tcPr>
+            <w:tcW w:w="3200" w:type="dxa"/>
+            <w:tcMar>
+              <w:top w:w="60" w:type="dxa"/>
+              <w:left w:w="80" w:type="dxa"/>
+              <w:bottom w:w="60" w:type="dxa"/>
+              <w:right w:w="80" w:type="dxa"/>
+            </w:tcMar>
+            <w:vAlign w:val="center"/>
+          </w:tcPr>
+          <w:p>
+            <w:pPr>
+              <w:spacing w:after="0"/>
+              <w:rPr>
+                <w:sz w:val="19"/>
+              </w:rPr>
+            </w:pPr>
+            <w:r>
+              <w:rPr>
+                <w:sz w:val="19"/>
+                <w:szCs w:val="19"/>
+              </w:rPr>
+              <w:t xml:space="preserve">17% → 8%</w:t>
+            </w:r>
+          </w:p>
+        </w:tc>
+        <w:tc>
+          <w:tcPr>
+            <w:tcW w:w="3200" w:type="dxa"/>
+            <w:tcMar>
+              <w:top w:w="60" w:type="dxa"/>
+              <w:left w:w="80" w:type="dxa"/>
+              <w:bottom w:w="60" w:type="dxa"/>
+              <w:right w:w="80" w:type="dxa"/>
+            </w:tcMar>
+            <w:vAlign w:val="center"/>
+          </w:tcPr>
+          <w:p>
+            <w:pPr>
+              <w:spacing w:after="0"/>
+              <w:rPr>
+                <w:sz w:val="19"/>
+              </w:rPr>
+            </w:pPr>
+            <w:r>
+              <w:rPr>
+                <w:sz w:val="19"/>
+                <w:szCs w:val="19"/>
+              </w:rPr>
+              <w:t xml:space="preserve">97% → 95%</w:t>
+            </w:r>
+          </w:p>
+        </w:tc>
+      </w:tr>
+      <w:tr>
+        <w:trPr>
+          <w:cantSplit/>
+          <w:jc w:val="center"/>
+        </w:trPr>
+        <w:tc>
+          <w:tcPr>
+            <w:tcW w:w="3300" w:type="dxa"/>
+            <w:tcMar>
+              <w:top w:w="60" w:type="dxa"/>
+              <w:left w:w="80" w:type="dxa"/>
+              <w:bottom w:w="60" w:type="dxa"/>
+              <w:right w:w="80" w:type="dxa"/>
+            </w:tcMar>
+            <w:vAlign w:val="center"/>
+          </w:tcPr>
+          <w:p>
+            <w:pPr>
+              <w:spacing w:after="0"/>
+              <w:rPr>
+                <w:sz w:val="19"/>
+              </w:rPr>
+            </w:pPr>
+            <w:r>
+              <w:rPr>
+                <w:sz w:val="19"/>
+                <w:szCs w:val="19"/>
+              </w:rPr>
+              <w:t xml:space="preserve">FF++ (seen methods)</w:t>
+            </w:r>
+          </w:p>
+        </w:tc>
+        <w:tc>
+          <w:tcPr>
+            <w:tcW w:w="3200" w:type="dxa"/>
+            <w:tcMar>
+              <w:top w:w="60" w:type="dxa"/>
+              <w:left w:w="80" w:type="dxa"/>
+              <w:bottom w:w="60" w:type="dxa"/>
+              <w:right w:w="80" w:type="dxa"/>
+            </w:tcMar>
+            <w:vAlign w:val="center"/>
+          </w:tcPr>
+          <w:p>
+            <w:pPr>
+              <w:spacing w:after="0"/>
+              <w:rPr>
+                <w:sz w:val="19"/>
+              </w:rPr>
+            </w:pPr>
+            <w:r>
+              <w:rPr>
+                <w:sz w:val="19"/>
+                <w:szCs w:val="19"/>
+              </w:rPr>
+              <w:t xml:space="preserve">49% → 37%</w:t>
+            </w:r>
+          </w:p>
+        </w:tc>
+        <w:tc>
+          <w:tcPr>
+            <w:tcW w:w="3200" w:type="dxa"/>
+            <w:tcMar>
+              <w:top w:w="60" w:type="dxa"/>
+              <w:left w:w="80" w:type="dxa"/>
+              <w:bottom w:w="60" w:type="dxa"/>
+              <w:right w:w="80" w:type="dxa"/>
+            </w:tcMar>
+            <w:vAlign w:val="center"/>
+          </w:tcPr>
+          <w:p>
+            <w:pPr>
+              <w:spacing w:after="0"/>
+              <w:rPr>
+                <w:sz w:val="19"/>
+              </w:rPr>
+            </w:pPr>
+            <w:r>
+              <w:rPr>
+                <w:sz w:val="19"/>
+                <w:szCs w:val="19"/>
+              </w:rPr>
+              <w:t xml:space="preserve">96% → 91%</w:t>
+            </w:r>
+          </w:p>
+        </w:tc>
+      </w:tr>
+    </w:tbl>
+    <w:p>
+      <w:pPr>
+        <w:spacing w:after="60"/>
+        <w:rPr>
+          <w:sz w:val="12"/>
+        </w:rPr>
+      </w:pPr>
+    </w:p>
+    <w:p>
+      <w:pPr>
+        <w:rPr>
+          <w:sz w:val="24"/>
+        </w:rPr>
+      </w:pPr>
+      <w:r>
+        <w:rPr>
+          <w:sz w:val="24"/>
+          <w:szCs w:val="24"/>
+        </w:rPr>
+        <w:t xml:space="preserve">The higher threshold roughly halves false alarms on two sets for a loss of two to four points of fakes caught, and helps only partly on FaceForensics++. It is not enabled by default because the system cannot yet tell automatically that an image was re-uploaded; selecting it per case, or detecting degradation, is planned.</w:t>
       </w:r>
     </w:p>
     <w:p>
@@ -17951,7 +18374,7 @@
           <w:sz w:val="24"/>
           <w:szCs w:val="24"/>
         </w:rPr>
-        <w:t xml:space="preserve">Tune an image threshold on degraded (re-uploaded) calibration images to reduce false alarms on screenshots and social-media copies.</w:t>
+        <w:t xml:space="preserve">Detect re-uploaded images automatically and apply the degraded-image threshold (measured in Section 5.3) only to them; FaceForensics++ copies still show 37 percent false alarms.</w:t>
       </w:r>
     </w:p>
     <w:p>

</xml_diff>